<commit_message>
Add administrator orders and promotions
</commit_message>
<xml_diff>
--- a/docs/Otchet_PM04_CYBERTAG_SQL.docx
+++ b/docs/Otchet_PM04_CYBERTAG_SQL.docx
@@ -2110,7 +2110,7 @@
         <w:jc w:val="both"/>
       </w:pPr>
       <w:r>
-        <w:t xml:space="preserve">В рамках практики разработана информационная система CYBERTAG с адаптивным многостраничным веб-интерфейсом, серверным приложением Node.js/Express и базой данных Microsoft SQL Server 2022 Express. Реализованы регистрация, вход по логину или email, безопасное хранение bcrypt-хэшей паролей и серверные пользовательские сессии.</w:t>
+        <w:t xml:space="preserve">В рамках практики разработана информационная система CYBERTAG с адаптивным многостраничным веб-интерфейсом, серверным приложением Node.js/Express и базой данных Microsoft SQL Server 2022 Express. Реализованы регистрация, вход, SQL-заказы, серверные сессии и административная панель для управления заказами и акциями.</w:t>
       </w:r>
     </w:p>
     <w:p>
@@ -2211,7 +2211,7 @@
         <w:jc w:val="both"/>
       </w:pPr>
       <w:r>
-        <w:t xml:space="preserve">реализованы 8 таблиц, ограничения целостности, 5 представлений, 4 хранимые процедуры и 3 пользовательские функции в Microsoft SQL Server 2022 Express;</w:t>
+        <w:t xml:space="preserve">реализованы 9 таблиц, ограничения целостности, 5 представлений, 4 хранимые процедуры, 3 пользовательские функции и 14 параметризованных сценариев запросов в Microsoft SQL Server 2022 Express;</w:t>
       </w:r>
     </w:p>
     <w:p>
@@ -2402,7 +2402,7 @@
         <w:jc w:val="both"/>
       </w:pPr>
       <w:r>
-        <w:t xml:space="preserve">В системе выделяются гость, зарегистрированный пользователь (customer) и администратор (admin). Гость просматривает страницы и формирует корзину. Зарегистрированный пользователь может перейти к оформлению после серверной авторизации. Роль администратора используется демонстрационной учётной записью manager и зарезервирована для дальнейшего расширения функций.</w:t>
+        <w:t xml:space="preserve">В системе выделяются гость, зарегистрированный пользователь (customer) и администратор (admin). Гость просматривает страницы и формирует корзину. Зарегистрированный пользователь оформляет SQL-заказ после авторизации. Администратор manager просматривает все заказы, изменяет их статус и добавляет акции.</w:t>
       </w:r>
     </w:p>
     <w:p>
@@ -3304,6 +3304,98 @@
           </w:p>
         </w:tc>
       </w:tr>
+      <w:tr>
+        <w:tblPrEx>
+          <w:tblCellMar>
+            <w:top w:w="0" w:type="dxa"/>
+            <w:bottom w:w="0" w:type="dxa"/>
+          </w:tblCellMar>
+        </w:tblPrEx>
+        <w:tc>
+          <w:tcPr>
+            <w:tcW w:w="2400" w:type="dxa"/>
+            <w:tcBorders>
+              <w:top w:val="single" w:sz="4" w:space="0" w:color="000000"/>
+              <w:left w:val="single" w:sz="4" w:space="0" w:color="000000"/>
+              <w:bottom w:val="single" w:sz="4" w:space="0" w:color="000000"/>
+              <w:right w:val="single" w:sz="4" w:space="0" w:color="000000"/>
+            </w:tcBorders>
+            <w:shd w:val="clear" w:color="auto" w:fill="auto"/>
+            <w:tcMar>
+              <w:top w:w="60" w:type="dxa"/>
+              <w:left w:w="108" w:type="dxa"/>
+              <w:bottom w:w="60" w:type="dxa"/>
+              <w:right w:w="108" w:type="dxa"/>
+            </w:tcMar>
+            <w:vAlign w:val="center"/>
+          </w:tcPr>
+          <w:p>
+            <w:r>
+              <w:rPr>
+                <w:sz w:val="24"/>
+                <w:szCs w:val="24"/>
+              </w:rPr>
+              <w:t xml:space="preserve">Акции (Promotions)</w:t>
+            </w:r>
+          </w:p>
+        </w:tc>
+        <w:tc>
+          <w:tcPr>
+            <w:tcW w:w="2800" w:type="dxa"/>
+            <w:tcBorders>
+              <w:top w:val="single" w:sz="4" w:space="0" w:color="000000"/>
+              <w:left w:val="single" w:sz="4" w:space="0" w:color="000000"/>
+              <w:bottom w:val="single" w:sz="4" w:space="0" w:color="000000"/>
+              <w:right w:val="single" w:sz="4" w:space="0" w:color="000000"/>
+            </w:tcBorders>
+            <w:shd w:val="clear" w:color="auto" w:fill="auto"/>
+            <w:tcMar>
+              <w:top w:w="60" w:type="dxa"/>
+              <w:left w:w="108" w:type="dxa"/>
+              <w:bottom w:w="60" w:type="dxa"/>
+              <w:right w:w="108" w:type="dxa"/>
+            </w:tcMar>
+            <w:vAlign w:val="center"/>
+          </w:tcPr>
+          <w:p>
+            <w:r>
+              <w:rPr>
+                <w:sz w:val="24"/>
+                <w:szCs w:val="24"/>
+              </w:rPr>
+              <w:t xml:space="preserve">Публикации администратора</w:t>
+            </w:r>
+          </w:p>
+        </w:tc>
+        <w:tc>
+          <w:tcPr>
+            <w:tcW w:w="3800" w:type="dxa"/>
+            <w:tcBorders>
+              <w:top w:val="single" w:sz="4" w:space="0" w:color="000000"/>
+              <w:left w:val="single" w:sz="4" w:space="0" w:color="000000"/>
+              <w:bottom w:val="single" w:sz="4" w:space="0" w:color="000000"/>
+              <w:right w:val="single" w:sz="4" w:space="0" w:color="000000"/>
+            </w:tcBorders>
+            <w:shd w:val="clear" w:color="auto" w:fill="auto"/>
+            <w:tcMar>
+              <w:top w:w="60" w:type="dxa"/>
+              <w:left w:w="108" w:type="dxa"/>
+              <w:bottom w:w="60" w:type="dxa"/>
+              <w:right w:w="108" w:type="dxa"/>
+            </w:tcMar>
+            <w:vAlign w:val="center"/>
+          </w:tcPr>
+          <w:p>
+            <w:r>
+              <w:rPr>
+                <w:sz w:val="24"/>
+                <w:szCs w:val="24"/>
+              </w:rPr>
+              <w:t xml:space="preserve">Название, срок, изображение</w:t>
+            </w:r>
+          </w:p>
+        </w:tc>
+      </w:tr>
     </w:tbl>
     <w:p>
       <w:pPr>
@@ -3317,7 +3409,7 @@
         <w:jc w:val="both"/>
       </w:pPr>
       <w:r>
-        <w:t xml:space="preserve">Предметная модель содержит таблицы каталога и заказов, а действующий контур авторизации использует Customers, Users и Sessions. При инициализации создаются 3 категории, 5 комплектов и демонстрационная учётная запись manager. Новые пользователи и их сессии появляются в базе только после регистрации и входа.</w:t>
+        <w:t xml:space="preserve">Предметная модель содержит таблицы каталога, заказов и Promotions, а контур авторизации использует Customers, Users и Sessions. При инициализации создаются 3 категории, 5 комплектов, 3 акции и административная учётная запись manager. Новые пользователи, заказы и сессии появляются после действий в интерфейсе.</w:t>
       </w:r>
     </w:p>
     <w:p>
@@ -3382,7 +3474,7 @@
         <w:rPr>
           <w:lang w:val="en-US"/>
         </w:rPr>
-        <w:t xml:space="preserve">Поток регистрации выполняется в транзакции уровня SERIALIZABLE. Сервер проверяет уникальность логина и email, создаёт запись Customers, вызывает процедуру pr_RegisterUser и создаёт строку Sessions. При любой ошибке транзакция откатывается. Основные потоки данных представлены в таблице ниже:</w:t>
+        <w:t xml:space="preserve">Административный поток начинается после проверки серверной сессии и роли admin. Панель запрашивает все заказы через GET /api/admin/orders, изменяет статус через PATCH и добавляет акции через POST /api/admin/promotions. Основные потоки данных представлены в таблице ниже:</w:t>
       </w:r>
     </w:p>
     <w:p>
@@ -4075,7 +4167,7 @@
                 <w:sz w:val="24"/>
                 <w:szCs w:val="24"/>
               </w:rPr>
-              <w:t xml:space="preserve">Браузер</w:t>
+              <w:t xml:space="preserve">Пользователь</w:t>
             </w:r>
           </w:p>
         </w:tc>
@@ -4103,7 +4195,7 @@
                 <w:sz w:val="24"/>
                 <w:szCs w:val="24"/>
               </w:rPr>
-              <w:t xml:space="preserve">GET /api/health</w:t>
+              <w:t xml:space="preserve">POST /api/orders</w:t>
             </w:r>
           </w:p>
         </w:tc>
@@ -4131,7 +4223,7 @@
                 <w:sz w:val="24"/>
                 <w:szCs w:val="24"/>
               </w:rPr>
-              <w:t xml:space="preserve">SQL-счётчики</w:t>
+              <w:t xml:space="preserve">Проверка сессии + pr_CreateOrder</w:t>
             </w:r>
           </w:p>
         </w:tc>
@@ -4159,7 +4251,7 @@
                 <w:sz w:val="24"/>
                 <w:szCs w:val="24"/>
               </w:rPr>
-              <w:t xml:space="preserve">Состояние БД</w:t>
+              <w:t xml:space="preserve">Orders и OrderItems</w:t>
             </w:r>
           </w:p>
         </w:tc>
@@ -4195,7 +4287,7 @@
                 <w:sz w:val="24"/>
                 <w:szCs w:val="24"/>
               </w:rPr>
-              <w:t xml:space="preserve">Браузер</w:t>
+              <w:t xml:space="preserve">Администратор</w:t>
             </w:r>
           </w:p>
         </w:tc>
@@ -4223,7 +4315,7 @@
                 <w:sz w:val="24"/>
                 <w:szCs w:val="24"/>
               </w:rPr>
-              <w:t xml:space="preserve">Статические страницы</w:t>
+              <w:t xml:space="preserve">GET /api/admin/orders</w:t>
             </w:r>
           </w:p>
         </w:tc>
@@ -4251,7 +4343,7 @@
                 <w:sz w:val="24"/>
                 <w:szCs w:val="24"/>
               </w:rPr>
-              <w:t xml:space="preserve">Express static</w:t>
+              <w:t xml:space="preserve">Проверка роли admin</w:t>
             </w:r>
           </w:p>
         </w:tc>
@@ -4279,7 +4371,7 @@
                 <w:sz w:val="24"/>
                 <w:szCs w:val="24"/>
               </w:rPr>
-              <w:t xml:space="preserve">HTML/CSS/JS и изображения</w:t>
+              <w:t xml:space="preserve">Все заказы</w:t>
             </w:r>
           </w:p>
         </w:tc>
@@ -4315,7 +4407,7 @@
                 <w:sz w:val="24"/>
                 <w:szCs w:val="24"/>
               </w:rPr>
-              <w:t xml:space="preserve">Пользователь</w:t>
+              <w:t xml:space="preserve">Администратор</w:t>
             </w:r>
           </w:p>
         </w:tc>
@@ -4343,7 +4435,7 @@
                 <w:sz w:val="24"/>
                 <w:szCs w:val="24"/>
               </w:rPr>
-              <w:t xml:space="preserve">Корзина</w:t>
+              <w:t xml:space="preserve">PATCH /api/admin/orders/:id/status</w:t>
             </w:r>
           </w:p>
         </w:tc>
@@ -4371,7 +4463,7 @@
                 <w:sz w:val="24"/>
                 <w:szCs w:val="24"/>
               </w:rPr>
-              <w:t xml:space="preserve">localStorage без персональных данных</w:t>
+              <w:t xml:space="preserve">Валидация статуса</w:t>
             </w:r>
           </w:p>
         </w:tc>
@@ -4399,7 +4491,7 @@
                 <w:sz w:val="24"/>
                 <w:szCs w:val="24"/>
               </w:rPr>
-              <w:t xml:space="preserve">Состав и сумма</w:t>
+              <w:t xml:space="preserve">Обновлённый заказ</w:t>
             </w:r>
           </w:p>
         </w:tc>
@@ -4463,6 +4555,486 @@
                 <w:sz w:val="24"/>
                 <w:szCs w:val="24"/>
               </w:rPr>
+              <w:t xml:space="preserve">POST /api/admin/promotions</w:t>
+            </w:r>
+          </w:p>
+        </w:tc>
+        <w:tc>
+          <w:tcPr>
+            <w:tcW w:w="2200" w:type="dxa"/>
+            <w:tcBorders>
+              <w:top w:val="single" w:sz="4" w:space="0" w:color="000000"/>
+              <w:left w:val="single" w:sz="4" w:space="0" w:color="000000"/>
+              <w:bottom w:val="single" w:sz="4" w:space="0" w:color="000000"/>
+              <w:right w:val="single" w:sz="4" w:space="0" w:color="000000"/>
+            </w:tcBorders>
+            <w:shd w:val="clear" w:color="auto" w:fill="auto"/>
+            <w:tcMar>
+              <w:top w:w="60" w:type="dxa"/>
+              <w:left w:w="108" w:type="dxa"/>
+              <w:bottom w:w="60" w:type="dxa"/>
+              <w:right w:w="108" w:type="dxa"/>
+            </w:tcMar>
+            <w:vAlign w:val="center"/>
+          </w:tcPr>
+          <w:p>
+            <w:r>
+              <w:rPr>
+                <w:sz w:val="24"/>
+                <w:szCs w:val="24"/>
+              </w:rPr>
+              <w:t xml:space="preserve">Валидация + INSERT</w:t>
+            </w:r>
+          </w:p>
+        </w:tc>
+        <w:tc>
+          <w:tcPr>
+            <w:tcW w:w="2800" w:type="dxa"/>
+            <w:tcBorders>
+              <w:top w:val="single" w:sz="4" w:space="0" w:color="000000"/>
+              <w:left w:val="single" w:sz="4" w:space="0" w:color="000000"/>
+              <w:bottom w:val="single" w:sz="4" w:space="0" w:color="000000"/>
+              <w:right w:val="single" w:sz="4" w:space="0" w:color="000000"/>
+            </w:tcBorders>
+            <w:shd w:val="clear" w:color="auto" w:fill="auto"/>
+            <w:tcMar>
+              <w:top w:w="60" w:type="dxa"/>
+              <w:left w:w="108" w:type="dxa"/>
+              <w:bottom w:w="60" w:type="dxa"/>
+              <w:right w:w="108" w:type="dxa"/>
+            </w:tcMar>
+            <w:vAlign w:val="center"/>
+          </w:tcPr>
+          <w:p>
+            <w:r>
+              <w:rPr>
+                <w:sz w:val="24"/>
+                <w:szCs w:val="24"/>
+              </w:rPr>
+              <w:t xml:space="preserve">Новая акция</w:t>
+            </w:r>
+          </w:p>
+        </w:tc>
+      </w:tr>
+      <w:tr>
+        <w:tblPrEx>
+          <w:tblCellMar>
+            <w:top w:w="0" w:type="dxa"/>
+            <w:bottom w:w="0" w:type="dxa"/>
+          </w:tblCellMar>
+        </w:tblPrEx>
+        <w:tc>
+          <w:tcPr>
+            <w:tcW w:w="2000" w:type="dxa"/>
+            <w:tcBorders>
+              <w:top w:val="single" w:sz="4" w:space="0" w:color="000000"/>
+              <w:left w:val="single" w:sz="4" w:space="0" w:color="000000"/>
+              <w:bottom w:val="single" w:sz="4" w:space="0" w:color="000000"/>
+              <w:right w:val="single" w:sz="4" w:space="0" w:color="000000"/>
+            </w:tcBorders>
+            <w:shd w:val="clear" w:color="auto" w:fill="auto"/>
+            <w:tcMar>
+              <w:top w:w="60" w:type="dxa"/>
+              <w:left w:w="108" w:type="dxa"/>
+              <w:bottom w:w="60" w:type="dxa"/>
+              <w:right w:w="108" w:type="dxa"/>
+            </w:tcMar>
+            <w:vAlign w:val="center"/>
+          </w:tcPr>
+          <w:p>
+            <w:r>
+              <w:rPr>
+                <w:sz w:val="24"/>
+                <w:szCs w:val="24"/>
+              </w:rPr>
+              <w:t xml:space="preserve">Браузер</w:t>
+            </w:r>
+          </w:p>
+        </w:tc>
+        <w:tc>
+          <w:tcPr>
+            <w:tcW w:w="2200" w:type="dxa"/>
+            <w:tcBorders>
+              <w:top w:val="single" w:sz="4" w:space="0" w:color="000000"/>
+              <w:left w:val="single" w:sz="4" w:space="0" w:color="000000"/>
+              <w:bottom w:val="single" w:sz="4" w:space="0" w:color="000000"/>
+              <w:right w:val="single" w:sz="4" w:space="0" w:color="000000"/>
+            </w:tcBorders>
+            <w:shd w:val="clear" w:color="auto" w:fill="auto"/>
+            <w:tcMar>
+              <w:top w:w="60" w:type="dxa"/>
+              <w:left w:w="108" w:type="dxa"/>
+              <w:bottom w:w="60" w:type="dxa"/>
+              <w:right w:w="108" w:type="dxa"/>
+            </w:tcMar>
+            <w:vAlign w:val="center"/>
+          </w:tcPr>
+          <w:p>
+            <w:r>
+              <w:rPr>
+                <w:sz w:val="24"/>
+                <w:szCs w:val="24"/>
+              </w:rPr>
+              <w:t xml:space="preserve">GET /api/health</w:t>
+            </w:r>
+          </w:p>
+        </w:tc>
+        <w:tc>
+          <w:tcPr>
+            <w:tcW w:w="2200" w:type="dxa"/>
+            <w:tcBorders>
+              <w:top w:val="single" w:sz="4" w:space="0" w:color="000000"/>
+              <w:left w:val="single" w:sz="4" w:space="0" w:color="000000"/>
+              <w:bottom w:val="single" w:sz="4" w:space="0" w:color="000000"/>
+              <w:right w:val="single" w:sz="4" w:space="0" w:color="000000"/>
+            </w:tcBorders>
+            <w:shd w:val="clear" w:color="auto" w:fill="auto"/>
+            <w:tcMar>
+              <w:top w:w="60" w:type="dxa"/>
+              <w:left w:w="108" w:type="dxa"/>
+              <w:bottom w:w="60" w:type="dxa"/>
+              <w:right w:w="108" w:type="dxa"/>
+            </w:tcMar>
+            <w:vAlign w:val="center"/>
+          </w:tcPr>
+          <w:p>
+            <w:r>
+              <w:rPr>
+                <w:sz w:val="24"/>
+                <w:szCs w:val="24"/>
+              </w:rPr>
+              <w:t xml:space="preserve">SQL-счётчики</w:t>
+            </w:r>
+          </w:p>
+        </w:tc>
+        <w:tc>
+          <w:tcPr>
+            <w:tcW w:w="2800" w:type="dxa"/>
+            <w:tcBorders>
+              <w:top w:val="single" w:sz="4" w:space="0" w:color="000000"/>
+              <w:left w:val="single" w:sz="4" w:space="0" w:color="000000"/>
+              <w:bottom w:val="single" w:sz="4" w:space="0" w:color="000000"/>
+              <w:right w:val="single" w:sz="4" w:space="0" w:color="000000"/>
+            </w:tcBorders>
+            <w:shd w:val="clear" w:color="auto" w:fill="auto"/>
+            <w:tcMar>
+              <w:top w:w="60" w:type="dxa"/>
+              <w:left w:w="108" w:type="dxa"/>
+              <w:bottom w:w="60" w:type="dxa"/>
+              <w:right w:w="108" w:type="dxa"/>
+            </w:tcMar>
+            <w:vAlign w:val="center"/>
+          </w:tcPr>
+          <w:p>
+            <w:r>
+              <w:rPr>
+                <w:sz w:val="24"/>
+                <w:szCs w:val="24"/>
+              </w:rPr>
+              <w:t xml:space="preserve">Состояние БД</w:t>
+            </w:r>
+          </w:p>
+        </w:tc>
+      </w:tr>
+      <w:tr>
+        <w:tblPrEx>
+          <w:tblCellMar>
+            <w:top w:w="0" w:type="dxa"/>
+            <w:bottom w:w="0" w:type="dxa"/>
+          </w:tblCellMar>
+        </w:tblPrEx>
+        <w:tc>
+          <w:tcPr>
+            <w:tcW w:w="2000" w:type="dxa"/>
+            <w:tcBorders>
+              <w:top w:val="single" w:sz="4" w:space="0" w:color="000000"/>
+              <w:left w:val="single" w:sz="4" w:space="0" w:color="000000"/>
+              <w:bottom w:val="single" w:sz="4" w:space="0" w:color="000000"/>
+              <w:right w:val="single" w:sz="4" w:space="0" w:color="000000"/>
+            </w:tcBorders>
+            <w:shd w:val="clear" w:color="auto" w:fill="auto"/>
+            <w:tcMar>
+              <w:top w:w="60" w:type="dxa"/>
+              <w:left w:w="108" w:type="dxa"/>
+              <w:bottom w:w="60" w:type="dxa"/>
+              <w:right w:w="108" w:type="dxa"/>
+            </w:tcMar>
+            <w:vAlign w:val="center"/>
+          </w:tcPr>
+          <w:p>
+            <w:r>
+              <w:rPr>
+                <w:sz w:val="24"/>
+                <w:szCs w:val="24"/>
+              </w:rPr>
+              <w:t xml:space="preserve">Браузер</w:t>
+            </w:r>
+          </w:p>
+        </w:tc>
+        <w:tc>
+          <w:tcPr>
+            <w:tcW w:w="2200" w:type="dxa"/>
+            <w:tcBorders>
+              <w:top w:val="single" w:sz="4" w:space="0" w:color="000000"/>
+              <w:left w:val="single" w:sz="4" w:space="0" w:color="000000"/>
+              <w:bottom w:val="single" w:sz="4" w:space="0" w:color="000000"/>
+              <w:right w:val="single" w:sz="4" w:space="0" w:color="000000"/>
+            </w:tcBorders>
+            <w:shd w:val="clear" w:color="auto" w:fill="auto"/>
+            <w:tcMar>
+              <w:top w:w="60" w:type="dxa"/>
+              <w:left w:w="108" w:type="dxa"/>
+              <w:bottom w:w="60" w:type="dxa"/>
+              <w:right w:w="108" w:type="dxa"/>
+            </w:tcMar>
+            <w:vAlign w:val="center"/>
+          </w:tcPr>
+          <w:p>
+            <w:r>
+              <w:rPr>
+                <w:sz w:val="24"/>
+                <w:szCs w:val="24"/>
+              </w:rPr>
+              <w:t xml:space="preserve">Статические страницы</w:t>
+            </w:r>
+          </w:p>
+        </w:tc>
+        <w:tc>
+          <w:tcPr>
+            <w:tcW w:w="2200" w:type="dxa"/>
+            <w:tcBorders>
+              <w:top w:val="single" w:sz="4" w:space="0" w:color="000000"/>
+              <w:left w:val="single" w:sz="4" w:space="0" w:color="000000"/>
+              <w:bottom w:val="single" w:sz="4" w:space="0" w:color="000000"/>
+              <w:right w:val="single" w:sz="4" w:space="0" w:color="000000"/>
+            </w:tcBorders>
+            <w:shd w:val="clear" w:color="auto" w:fill="auto"/>
+            <w:tcMar>
+              <w:top w:w="60" w:type="dxa"/>
+              <w:left w:w="108" w:type="dxa"/>
+              <w:bottom w:w="60" w:type="dxa"/>
+              <w:right w:w="108" w:type="dxa"/>
+            </w:tcMar>
+            <w:vAlign w:val="center"/>
+          </w:tcPr>
+          <w:p>
+            <w:r>
+              <w:rPr>
+                <w:sz w:val="24"/>
+                <w:szCs w:val="24"/>
+              </w:rPr>
+              <w:t xml:space="preserve">Express static</w:t>
+            </w:r>
+          </w:p>
+        </w:tc>
+        <w:tc>
+          <w:tcPr>
+            <w:tcW w:w="2800" w:type="dxa"/>
+            <w:tcBorders>
+              <w:top w:val="single" w:sz="4" w:space="0" w:color="000000"/>
+              <w:left w:val="single" w:sz="4" w:space="0" w:color="000000"/>
+              <w:bottom w:val="single" w:sz="4" w:space="0" w:color="000000"/>
+              <w:right w:val="single" w:sz="4" w:space="0" w:color="000000"/>
+            </w:tcBorders>
+            <w:shd w:val="clear" w:color="auto" w:fill="auto"/>
+            <w:tcMar>
+              <w:top w:w="60" w:type="dxa"/>
+              <w:left w:w="108" w:type="dxa"/>
+              <w:bottom w:w="60" w:type="dxa"/>
+              <w:right w:w="108" w:type="dxa"/>
+            </w:tcMar>
+            <w:vAlign w:val="center"/>
+          </w:tcPr>
+          <w:p>
+            <w:r>
+              <w:rPr>
+                <w:sz w:val="24"/>
+                <w:szCs w:val="24"/>
+              </w:rPr>
+              <w:t xml:space="preserve">HTML/CSS/JS и изображения</w:t>
+            </w:r>
+          </w:p>
+        </w:tc>
+      </w:tr>
+      <w:tr>
+        <w:tblPrEx>
+          <w:tblCellMar>
+            <w:top w:w="0" w:type="dxa"/>
+            <w:bottom w:w="0" w:type="dxa"/>
+          </w:tblCellMar>
+        </w:tblPrEx>
+        <w:tc>
+          <w:tcPr>
+            <w:tcW w:w="2000" w:type="dxa"/>
+            <w:tcBorders>
+              <w:top w:val="single" w:sz="4" w:space="0" w:color="000000"/>
+              <w:left w:val="single" w:sz="4" w:space="0" w:color="000000"/>
+              <w:bottom w:val="single" w:sz="4" w:space="0" w:color="000000"/>
+              <w:right w:val="single" w:sz="4" w:space="0" w:color="000000"/>
+            </w:tcBorders>
+            <w:shd w:val="clear" w:color="auto" w:fill="auto"/>
+            <w:tcMar>
+              <w:top w:w="60" w:type="dxa"/>
+              <w:left w:w="108" w:type="dxa"/>
+              <w:bottom w:w="60" w:type="dxa"/>
+              <w:right w:w="108" w:type="dxa"/>
+            </w:tcMar>
+            <w:vAlign w:val="center"/>
+          </w:tcPr>
+          <w:p>
+            <w:r>
+              <w:rPr>
+                <w:sz w:val="24"/>
+                <w:szCs w:val="24"/>
+              </w:rPr>
+              <w:t xml:space="preserve">Пользователь</w:t>
+            </w:r>
+          </w:p>
+        </w:tc>
+        <w:tc>
+          <w:tcPr>
+            <w:tcW w:w="2200" w:type="dxa"/>
+            <w:tcBorders>
+              <w:top w:val="single" w:sz="4" w:space="0" w:color="000000"/>
+              <w:left w:val="single" w:sz="4" w:space="0" w:color="000000"/>
+              <w:bottom w:val="single" w:sz="4" w:space="0" w:color="000000"/>
+              <w:right w:val="single" w:sz="4" w:space="0" w:color="000000"/>
+            </w:tcBorders>
+            <w:shd w:val="clear" w:color="auto" w:fill="auto"/>
+            <w:tcMar>
+              <w:top w:w="60" w:type="dxa"/>
+              <w:left w:w="108" w:type="dxa"/>
+              <w:bottom w:w="60" w:type="dxa"/>
+              <w:right w:w="108" w:type="dxa"/>
+            </w:tcMar>
+            <w:vAlign w:val="center"/>
+          </w:tcPr>
+          <w:p>
+            <w:r>
+              <w:rPr>
+                <w:sz w:val="24"/>
+                <w:szCs w:val="24"/>
+              </w:rPr>
+              <w:t xml:space="preserve">Корзина</w:t>
+            </w:r>
+          </w:p>
+        </w:tc>
+        <w:tc>
+          <w:tcPr>
+            <w:tcW w:w="2200" w:type="dxa"/>
+            <w:tcBorders>
+              <w:top w:val="single" w:sz="4" w:space="0" w:color="000000"/>
+              <w:left w:val="single" w:sz="4" w:space="0" w:color="000000"/>
+              <w:bottom w:val="single" w:sz="4" w:space="0" w:color="000000"/>
+              <w:right w:val="single" w:sz="4" w:space="0" w:color="000000"/>
+            </w:tcBorders>
+            <w:shd w:val="clear" w:color="auto" w:fill="auto"/>
+            <w:tcMar>
+              <w:top w:w="60" w:type="dxa"/>
+              <w:left w:w="108" w:type="dxa"/>
+              <w:bottom w:w="60" w:type="dxa"/>
+              <w:right w:w="108" w:type="dxa"/>
+            </w:tcMar>
+            <w:vAlign w:val="center"/>
+          </w:tcPr>
+          <w:p>
+            <w:r>
+              <w:rPr>
+                <w:sz w:val="24"/>
+                <w:szCs w:val="24"/>
+              </w:rPr>
+              <w:t xml:space="preserve">localStorage без персональных данных</w:t>
+            </w:r>
+          </w:p>
+        </w:tc>
+        <w:tc>
+          <w:tcPr>
+            <w:tcW w:w="2800" w:type="dxa"/>
+            <w:tcBorders>
+              <w:top w:val="single" w:sz="4" w:space="0" w:color="000000"/>
+              <w:left w:val="single" w:sz="4" w:space="0" w:color="000000"/>
+              <w:bottom w:val="single" w:sz="4" w:space="0" w:color="000000"/>
+              <w:right w:val="single" w:sz="4" w:space="0" w:color="000000"/>
+            </w:tcBorders>
+            <w:shd w:val="clear" w:color="auto" w:fill="auto"/>
+            <w:tcMar>
+              <w:top w:w="60" w:type="dxa"/>
+              <w:left w:w="108" w:type="dxa"/>
+              <w:bottom w:w="60" w:type="dxa"/>
+              <w:right w:w="108" w:type="dxa"/>
+            </w:tcMar>
+            <w:vAlign w:val="center"/>
+          </w:tcPr>
+          <w:p>
+            <w:r>
+              <w:rPr>
+                <w:sz w:val="24"/>
+                <w:szCs w:val="24"/>
+              </w:rPr>
+              <w:t xml:space="preserve">Состав и сумма</w:t>
+            </w:r>
+          </w:p>
+        </w:tc>
+      </w:tr>
+      <w:tr>
+        <w:tblPrEx>
+          <w:tblCellMar>
+            <w:top w:w="0" w:type="dxa"/>
+            <w:bottom w:w="0" w:type="dxa"/>
+          </w:tblCellMar>
+        </w:tblPrEx>
+        <w:tc>
+          <w:tcPr>
+            <w:tcW w:w="2000" w:type="dxa"/>
+            <w:tcBorders>
+              <w:top w:val="single" w:sz="4" w:space="0" w:color="000000"/>
+              <w:left w:val="single" w:sz="4" w:space="0" w:color="000000"/>
+              <w:bottom w:val="single" w:sz="4" w:space="0" w:color="000000"/>
+              <w:right w:val="single" w:sz="4" w:space="0" w:color="000000"/>
+            </w:tcBorders>
+            <w:shd w:val="clear" w:color="auto" w:fill="auto"/>
+            <w:tcMar>
+              <w:top w:w="60" w:type="dxa"/>
+              <w:left w:w="108" w:type="dxa"/>
+              <w:bottom w:w="60" w:type="dxa"/>
+              <w:right w:w="108" w:type="dxa"/>
+            </w:tcMar>
+            <w:vAlign w:val="center"/>
+          </w:tcPr>
+          <w:p>
+            <w:r>
+              <w:rPr>
+                <w:sz w:val="24"/>
+                <w:szCs w:val="24"/>
+              </w:rPr>
+              <w:t xml:space="preserve">Администратор</w:t>
+            </w:r>
+          </w:p>
+        </w:tc>
+        <w:tc>
+          <w:tcPr>
+            <w:tcW w:w="2200" w:type="dxa"/>
+            <w:tcBorders>
+              <w:top w:val="single" w:sz="4" w:space="0" w:color="000000"/>
+              <w:left w:val="single" w:sz="4" w:space="0" w:color="000000"/>
+              <w:bottom w:val="single" w:sz="4" w:space="0" w:color="000000"/>
+              <w:right w:val="single" w:sz="4" w:space="0" w:color="000000"/>
+            </w:tcBorders>
+            <w:shd w:val="clear" w:color="auto" w:fill="auto"/>
+            <w:tcMar>
+              <w:top w:w="60" w:type="dxa"/>
+              <w:left w:w="108" w:type="dxa"/>
+              <w:bottom w:w="60" w:type="dxa"/>
+              <w:right w:w="108" w:type="dxa"/>
+            </w:tcMar>
+            <w:vAlign w:val="center"/>
+          </w:tcPr>
+          <w:p>
+            <w:r>
+              <w:rPr>
+                <w:sz w:val="24"/>
+                <w:szCs w:val="24"/>
+              </w:rPr>
               <w:t xml:space="preserve">npm run db:init</w:t>
             </w:r>
           </w:p>
@@ -4587,7 +5159,7 @@
         <w:jc w:val="both"/>
       </w:pPr>
       <w:r>
-        <w:t xml:space="preserve">спроектировать реляционную базу данных CybertagShop с 8 таблицами, включая Users и Sessions;</w:t>
+        <w:t xml:space="preserve">спроектировать реляционную базу данных CybertagShop с 9 таблицами, включая Users, Sessions и Promotions;</w:t>
       </w:r>
     </w:p>
     <w:p>
@@ -4678,7 +5250,7 @@
         <w:jc w:val="both"/>
       </w:pPr>
       <w:r>
-        <w:t>разработать 10 параметризованных T-SQL запросов (04_Queries.sql);</w:t>
+        <w:t xml:space="preserve">разработать 14 параметризованных T-SQL сценариев запросов (sql/04_Queries.sql);</w:t>
       </w:r>
     </w:p>
     <w:p>
@@ -4717,7 +5289,7 @@
         <w:jc w:val="both"/>
       </w:pPr>
       <w:r>
-        <w:t xml:space="preserve">реализовать API проверки текущей сессии, выхода и автоматического продолжения оформления заказа;</w:t>
+        <w:t xml:space="preserve">реализовать панель администратора для просмотра заказов, изменения статуса и добавления акций;</w:t>
       </w:r>
     </w:p>
     <w:p>
@@ -5029,7 +5601,7 @@
                 <w:sz w:val="24"/>
                 <w:szCs w:val="24"/>
               </w:rPr>
-              <w:t xml:space="preserve">8 таблиц, ограничения, объекты БД</w:t>
+              <w:t xml:space="preserve">9 таблиц, ограничения, объекты БД</w:t>
             </w:r>
           </w:p>
         </w:tc>
@@ -5673,7 +6245,7 @@
                 <w:sz w:val="24"/>
                 <w:szCs w:val="24"/>
               </w:rPr>
-              <w:t xml:space="preserve">Регистрация, вход, сессия, выход</w:t>
+              <w:t xml:space="preserve">Регистрация, заказ, роли, статус, акция</w:t>
             </w:r>
           </w:p>
         </w:tc>
@@ -5728,7 +6300,7 @@
         <w:jc w:val="both"/>
       </w:pPr>
       <w:r>
-        <w:t xml:space="preserve">Информационная система выполняет функции просмотра оборудования и комплектов, управления корзиной, регистрации, входа по логину или email, проверки и завершения серверной сессии, перехода к оформлению и отображения личного кабинета.</w:t>
+        <w:t xml:space="preserve">Информационная система выполняет функции просмотра оборудования и комплектов, управления корзиной, регистрации, входа, создания SQL-заказа, проверки сессии, просмотра всех заказов администратором, изменения статуса и публикации акций.</w:t>
       </w:r>
     </w:p>
     <w:p>
@@ -6613,7 +7185,7 @@
                 <w:sz w:val="24"/>
                 <w:szCs w:val="24"/>
               </w:rPr>
-              <w:t xml:space="preserve">Переход после авторизации</w:t>
+              <w:t xml:space="preserve">Orders + OrderItems в SQL</w:t>
             </w:r>
           </w:p>
         </w:tc>
@@ -6649,6 +7221,282 @@
                 <w:sz w:val="24"/>
                 <w:szCs w:val="24"/>
               </w:rPr>
+              <w:t xml:space="preserve">Заказы администратора</w:t>
+            </w:r>
+          </w:p>
+        </w:tc>
+        <w:tc>
+          <w:tcPr>
+            <w:tcW w:w="2400" w:type="dxa"/>
+            <w:tcBorders>
+              <w:top w:val="single" w:sz="4" w:space="0" w:color="000000"/>
+              <w:left w:val="single" w:sz="4" w:space="0" w:color="000000"/>
+              <w:bottom w:val="single" w:sz="4" w:space="0" w:color="000000"/>
+              <w:right w:val="single" w:sz="4" w:space="0" w:color="000000"/>
+            </w:tcBorders>
+            <w:shd w:val="clear" w:color="auto" w:fill="auto"/>
+            <w:tcMar>
+              <w:top w:w="60" w:type="dxa"/>
+              <w:left w:w="108" w:type="dxa"/>
+              <w:bottom w:w="60" w:type="dxa"/>
+              <w:right w:w="108" w:type="dxa"/>
+            </w:tcMar>
+            <w:vAlign w:val="center"/>
+          </w:tcPr>
+          <w:p>
+            <w:r>
+              <w:rPr>
+                <w:sz w:val="24"/>
+                <w:szCs w:val="24"/>
+              </w:rPr>
+              <w:t xml:space="preserve">Панель</w:t>
+            </w:r>
+          </w:p>
+        </w:tc>
+        <w:tc>
+          <w:tcPr>
+            <w:tcW w:w="3954" w:type="dxa"/>
+            <w:tcBorders>
+              <w:top w:val="single" w:sz="4" w:space="0" w:color="000000"/>
+              <w:left w:val="single" w:sz="4" w:space="0" w:color="000000"/>
+              <w:bottom w:val="single" w:sz="4" w:space="0" w:color="000000"/>
+              <w:right w:val="single" w:sz="4" w:space="0" w:color="000000"/>
+            </w:tcBorders>
+            <w:shd w:val="clear" w:color="auto" w:fill="auto"/>
+            <w:tcMar>
+              <w:top w:w="60" w:type="dxa"/>
+              <w:left w:w="108" w:type="dxa"/>
+              <w:bottom w:w="60" w:type="dxa"/>
+              <w:right w:w="108" w:type="dxa"/>
+            </w:tcMar>
+            <w:vAlign w:val="center"/>
+          </w:tcPr>
+          <w:p>
+            <w:r>
+              <w:rPr>
+                <w:sz w:val="24"/>
+                <w:szCs w:val="24"/>
+              </w:rPr>
+              <w:t xml:space="preserve">Все клиенты, состав, сумма и статус</w:t>
+            </w:r>
+          </w:p>
+        </w:tc>
+      </w:tr>
+      <w:tr>
+        <w:tblPrEx>
+          <w:tblCellMar>
+            <w:top w:w="0" w:type="dxa"/>
+            <w:bottom w:w="0" w:type="dxa"/>
+          </w:tblCellMar>
+        </w:tblPrEx>
+        <w:tc>
+          <w:tcPr>
+            <w:tcW w:w="2800" w:type="dxa"/>
+            <w:tcBorders>
+              <w:top w:val="single" w:sz="4" w:space="0" w:color="000000"/>
+              <w:left w:val="single" w:sz="4" w:space="0" w:color="000000"/>
+              <w:bottom w:val="single" w:sz="4" w:space="0" w:color="000000"/>
+              <w:right w:val="single" w:sz="4" w:space="0" w:color="000000"/>
+            </w:tcBorders>
+            <w:shd w:val="clear" w:color="auto" w:fill="auto"/>
+            <w:tcMar>
+              <w:top w:w="60" w:type="dxa"/>
+              <w:left w:w="108" w:type="dxa"/>
+              <w:bottom w:w="60" w:type="dxa"/>
+              <w:right w:w="108" w:type="dxa"/>
+            </w:tcMar>
+            <w:vAlign w:val="center"/>
+          </w:tcPr>
+          <w:p>
+            <w:r>
+              <w:rPr>
+                <w:sz w:val="24"/>
+                <w:szCs w:val="24"/>
+              </w:rPr>
+              <w:t xml:space="preserve">Изменение статуса</w:t>
+            </w:r>
+          </w:p>
+        </w:tc>
+        <w:tc>
+          <w:tcPr>
+            <w:tcW w:w="2400" w:type="dxa"/>
+            <w:tcBorders>
+              <w:top w:val="single" w:sz="4" w:space="0" w:color="000000"/>
+              <w:left w:val="single" w:sz="4" w:space="0" w:color="000000"/>
+              <w:bottom w:val="single" w:sz="4" w:space="0" w:color="000000"/>
+              <w:right w:val="single" w:sz="4" w:space="0" w:color="000000"/>
+            </w:tcBorders>
+            <w:shd w:val="clear" w:color="auto" w:fill="auto"/>
+            <w:tcMar>
+              <w:top w:w="60" w:type="dxa"/>
+              <w:left w:w="108" w:type="dxa"/>
+              <w:bottom w:w="60" w:type="dxa"/>
+              <w:right w:w="108" w:type="dxa"/>
+            </w:tcMar>
+            <w:vAlign w:val="center"/>
+          </w:tcPr>
+          <w:p>
+            <w:r>
+              <w:rPr>
+                <w:sz w:val="24"/>
+                <w:szCs w:val="24"/>
+              </w:rPr>
+              <w:t xml:space="preserve">Панель</w:t>
+            </w:r>
+          </w:p>
+        </w:tc>
+        <w:tc>
+          <w:tcPr>
+            <w:tcW w:w="3954" w:type="dxa"/>
+            <w:tcBorders>
+              <w:top w:val="single" w:sz="4" w:space="0" w:color="000000"/>
+              <w:left w:val="single" w:sz="4" w:space="0" w:color="000000"/>
+              <w:bottom w:val="single" w:sz="4" w:space="0" w:color="000000"/>
+              <w:right w:val="single" w:sz="4" w:space="0" w:color="000000"/>
+            </w:tcBorders>
+            <w:shd w:val="clear" w:color="auto" w:fill="auto"/>
+            <w:tcMar>
+              <w:top w:w="60" w:type="dxa"/>
+              <w:left w:w="108" w:type="dxa"/>
+              <w:bottom w:w="60" w:type="dxa"/>
+              <w:right w:w="108" w:type="dxa"/>
+            </w:tcMar>
+            <w:vAlign w:val="center"/>
+          </w:tcPr>
+          <w:p>
+            <w:r>
+              <w:rPr>
+                <w:sz w:val="24"/>
+                <w:szCs w:val="24"/>
+              </w:rPr>
+              <w:t xml:space="preserve">new / processing / shipped / done / cancelled</w:t>
+            </w:r>
+          </w:p>
+        </w:tc>
+      </w:tr>
+      <w:tr>
+        <w:tblPrEx>
+          <w:tblCellMar>
+            <w:top w:w="0" w:type="dxa"/>
+            <w:bottom w:w="0" w:type="dxa"/>
+          </w:tblCellMar>
+        </w:tblPrEx>
+        <w:tc>
+          <w:tcPr>
+            <w:tcW w:w="2800" w:type="dxa"/>
+            <w:tcBorders>
+              <w:top w:val="single" w:sz="4" w:space="0" w:color="000000"/>
+              <w:left w:val="single" w:sz="4" w:space="0" w:color="000000"/>
+              <w:bottom w:val="single" w:sz="4" w:space="0" w:color="000000"/>
+              <w:right w:val="single" w:sz="4" w:space="0" w:color="000000"/>
+            </w:tcBorders>
+            <w:shd w:val="clear" w:color="auto" w:fill="auto"/>
+            <w:tcMar>
+              <w:top w:w="60" w:type="dxa"/>
+              <w:left w:w="108" w:type="dxa"/>
+              <w:bottom w:w="60" w:type="dxa"/>
+              <w:right w:w="108" w:type="dxa"/>
+            </w:tcMar>
+            <w:vAlign w:val="center"/>
+          </w:tcPr>
+          <w:p>
+            <w:r>
+              <w:rPr>
+                <w:sz w:val="24"/>
+                <w:szCs w:val="24"/>
+              </w:rPr>
+              <w:t xml:space="preserve">Добавление акции</w:t>
+            </w:r>
+          </w:p>
+        </w:tc>
+        <w:tc>
+          <w:tcPr>
+            <w:tcW w:w="2400" w:type="dxa"/>
+            <w:tcBorders>
+              <w:top w:val="single" w:sz="4" w:space="0" w:color="000000"/>
+              <w:left w:val="single" w:sz="4" w:space="0" w:color="000000"/>
+              <w:bottom w:val="single" w:sz="4" w:space="0" w:color="000000"/>
+              <w:right w:val="single" w:sz="4" w:space="0" w:color="000000"/>
+            </w:tcBorders>
+            <w:shd w:val="clear" w:color="auto" w:fill="auto"/>
+            <w:tcMar>
+              <w:top w:w="60" w:type="dxa"/>
+              <w:left w:w="108" w:type="dxa"/>
+              <w:bottom w:w="60" w:type="dxa"/>
+              <w:right w:w="108" w:type="dxa"/>
+            </w:tcMar>
+            <w:vAlign w:val="center"/>
+          </w:tcPr>
+          <w:p>
+            <w:r>
+              <w:rPr>
+                <w:sz w:val="24"/>
+                <w:szCs w:val="24"/>
+              </w:rPr>
+              <w:t xml:space="preserve">Панель</w:t>
+            </w:r>
+          </w:p>
+        </w:tc>
+        <w:tc>
+          <w:tcPr>
+            <w:tcW w:w="3954" w:type="dxa"/>
+            <w:tcBorders>
+              <w:top w:val="single" w:sz="4" w:space="0" w:color="000000"/>
+              <w:left w:val="single" w:sz="4" w:space="0" w:color="000000"/>
+              <w:bottom w:val="single" w:sz="4" w:space="0" w:color="000000"/>
+              <w:right w:val="single" w:sz="4" w:space="0" w:color="000000"/>
+            </w:tcBorders>
+            <w:shd w:val="clear" w:color="auto" w:fill="auto"/>
+            <w:tcMar>
+              <w:top w:w="60" w:type="dxa"/>
+              <w:left w:w="108" w:type="dxa"/>
+              <w:bottom w:w="60" w:type="dxa"/>
+              <w:right w:w="108" w:type="dxa"/>
+            </w:tcMar>
+            <w:vAlign w:val="center"/>
+          </w:tcPr>
+          <w:p>
+            <w:r>
+              <w:rPr>
+                <w:sz w:val="24"/>
+                <w:szCs w:val="24"/>
+              </w:rPr>
+              <w:t xml:space="preserve">Новая строка Promotions</w:t>
+            </w:r>
+          </w:p>
+        </w:tc>
+      </w:tr>
+      <w:tr>
+        <w:tblPrEx>
+          <w:tblCellMar>
+            <w:top w:w="0" w:type="dxa"/>
+            <w:bottom w:w="0" w:type="dxa"/>
+          </w:tblCellMar>
+        </w:tblPrEx>
+        <w:tc>
+          <w:tcPr>
+            <w:tcW w:w="2800" w:type="dxa"/>
+            <w:tcBorders>
+              <w:top w:val="single" w:sz="4" w:space="0" w:color="000000"/>
+              <w:left w:val="single" w:sz="4" w:space="0" w:color="000000"/>
+              <w:bottom w:val="single" w:sz="4" w:space="0" w:color="000000"/>
+              <w:right w:val="single" w:sz="4" w:space="0" w:color="000000"/>
+            </w:tcBorders>
+            <w:shd w:val="clear" w:color="auto" w:fill="auto"/>
+            <w:tcMar>
+              <w:top w:w="60" w:type="dxa"/>
+              <w:left w:w="108" w:type="dxa"/>
+              <w:bottom w:w="60" w:type="dxa"/>
+              <w:right w:w="108" w:type="dxa"/>
+            </w:tcMar>
+            <w:vAlign w:val="center"/>
+          </w:tcPr>
+          <w:p>
+            <w:r>
+              <w:rPr>
+                <w:sz w:val="24"/>
+                <w:szCs w:val="24"/>
+              </w:rPr>
               <w:t xml:space="preserve">Просмотр софта</w:t>
             </w:r>
           </w:p>
@@ -6764,7 +7612,7 @@
         <w:jc w:val="both"/>
       </w:pPr>
       <w:r>
-        <w:t xml:space="preserve">Логическая модель базы CybertagShop содержит предметные таблицы каталога и заказов, а также рабочий контур аутентификации. Customers хранит имя и email, Users — логин, bcrypt-хэш и роль, Sessions — SHA-256-хэш токена и срок действия. Categories поддерживает иерархию через ParentId.</w:t>
+        <w:t xml:space="preserve">Логическая модель базы CybertagShop содержит таблицы каталога, заказов, Promotions и рабочий контур аутентификации. Customers хранит имя и email, Users — логин, bcrypt-хэш и роль, Sessions — SHA-256-хэш токена и срок действия. Promotions хранит описание, срок и изображение акции.</w:t>
       </w:r>
     </w:p>
     <w:p>
@@ -6774,7 +7622,7 @@
         <w:jc w:val="both"/>
       </w:pPr>
       <w:r>
-        <w:t xml:space="preserve">OrderItems связывает заказ и товар, фиксируя количество и историческую цену. Users связан с Customers необязательным внешним ключом CustomerId. Sessions связан с Users отношением 1:N и удаляется каскадно вместе с пользователем.</w:t>
+        <w:t xml:space="preserve">OrderItems связывает заказ и товар, фиксируя количество и историческую цену. Users связан с Customers, Sessions и Promotions. Sessions удаляется каскадно вместе с пользователем, а CreatedByUserId в Promotions фиксирует автора акции.</w:t>
       </w:r>
     </w:p>
     <w:p>
@@ -7690,6 +8538,102 @@
                 <w:lang w:val="en-US"/>
               </w:rPr>
               <w:t xml:space="preserve">SessionId, UserId, TokenHash, ExpiresAt</w:t>
+            </w:r>
+          </w:p>
+        </w:tc>
+      </w:tr>
+      <w:tr>
+        <w:tblPrEx>
+          <w:tblCellMar>
+            <w:top w:w="0" w:type="dxa"/>
+            <w:bottom w:w="0" w:type="dxa"/>
+          </w:tblCellMar>
+        </w:tblPrEx>
+        <w:tc>
+          <w:tcPr>
+            <w:tcW w:w="2000" w:type="dxa"/>
+            <w:tcBorders>
+              <w:top w:val="single" w:sz="4" w:space="0" w:color="000000"/>
+              <w:left w:val="single" w:sz="4" w:space="0" w:color="000000"/>
+              <w:bottom w:val="single" w:sz="4" w:space="0" w:color="000000"/>
+              <w:right w:val="single" w:sz="4" w:space="0" w:color="000000"/>
+            </w:tcBorders>
+            <w:shd w:val="clear" w:color="auto" w:fill="auto"/>
+            <w:tcMar>
+              <w:top w:w="60" w:type="dxa"/>
+              <w:left w:w="108" w:type="dxa"/>
+              <w:bottom w:w="60" w:type="dxa"/>
+              <w:right w:w="108" w:type="dxa"/>
+            </w:tcMar>
+            <w:vAlign w:val="center"/>
+          </w:tcPr>
+          <w:p>
+            <w:r>
+              <w:rPr>
+                <w:sz w:val="24"/>
+                <w:szCs w:val="24"/>
+              </w:rPr>
+              <w:t xml:space="preserve">Promotions</w:t>
+            </w:r>
+          </w:p>
+        </w:tc>
+        <w:tc>
+          <w:tcPr>
+            <w:tcW w:w="2600" w:type="dxa"/>
+            <w:tcBorders>
+              <w:top w:val="single" w:sz="4" w:space="0" w:color="000000"/>
+              <w:left w:val="single" w:sz="4" w:space="0" w:color="000000"/>
+              <w:bottom w:val="single" w:sz="4" w:space="0" w:color="000000"/>
+              <w:right w:val="single" w:sz="4" w:space="0" w:color="000000"/>
+            </w:tcBorders>
+            <w:shd w:val="clear" w:color="auto" w:fill="auto"/>
+            <w:tcMar>
+              <w:top w:w="60" w:type="dxa"/>
+              <w:left w:w="108" w:type="dxa"/>
+              <w:bottom w:w="60" w:type="dxa"/>
+              <w:right w:w="108" w:type="dxa"/>
+            </w:tcMar>
+            <w:vAlign w:val="center"/>
+          </w:tcPr>
+          <w:p>
+            <w:r>
+              <w:rPr>
+                <w:sz w:val="24"/>
+                <w:szCs w:val="24"/>
+              </w:rPr>
+              <w:t xml:space="preserve">Акции</w:t>
+            </w:r>
+          </w:p>
+        </w:tc>
+        <w:tc>
+          <w:tcPr>
+            <w:tcW w:w="4554" w:type="dxa"/>
+            <w:tcBorders>
+              <w:top w:val="single" w:sz="4" w:space="0" w:color="000000"/>
+              <w:left w:val="single" w:sz="4" w:space="0" w:color="000000"/>
+              <w:bottom w:val="single" w:sz="4" w:space="0" w:color="000000"/>
+              <w:right w:val="single" w:sz="4" w:space="0" w:color="000000"/>
+            </w:tcBorders>
+            <w:shd w:val="clear" w:color="auto" w:fill="auto"/>
+            <w:tcMar>
+              <w:top w:w="60" w:type="dxa"/>
+              <w:left w:w="108" w:type="dxa"/>
+              <w:bottom w:w="60" w:type="dxa"/>
+              <w:right w:w="108" w:type="dxa"/>
+            </w:tcMar>
+            <w:vAlign w:val="center"/>
+          </w:tcPr>
+          <w:p>
+            <w:pPr>
+              <w:rPr>
+                <w:lang w:val="en-US"/>
+              </w:rPr>
+            </w:pPr>
+            <w:r>
+              <w:rPr>
+                <w:lang w:val="en-US"/>
+              </w:rPr>
+              <w:t xml:space="preserve">PromotionId, Title, DateLabel, CreatedByUserId</w:t>
             </w:r>
           </w:p>
         </w:tc>
@@ -11167,6 +12111,98 @@
           </w:p>
         </w:tc>
       </w:tr>
+      <w:tr>
+        <w:tblPrEx>
+          <w:tblCellMar>
+            <w:top w:w="0" w:type="dxa"/>
+            <w:bottom w:w="0" w:type="dxa"/>
+          </w:tblCellMar>
+        </w:tblPrEx>
+        <w:tc>
+          <w:tcPr>
+            <w:tcW w:w="3000" w:type="dxa"/>
+            <w:tcBorders>
+              <w:top w:val="single" w:sz="4" w:space="0" w:color="000000"/>
+              <w:left w:val="single" w:sz="4" w:space="0" w:color="000000"/>
+              <w:bottom w:val="single" w:sz="4" w:space="0" w:color="000000"/>
+              <w:right w:val="single" w:sz="4" w:space="0" w:color="000000"/>
+            </w:tcBorders>
+            <w:shd w:val="clear" w:color="auto" w:fill="auto"/>
+            <w:tcMar>
+              <w:top w:w="60" w:type="dxa"/>
+              <w:left w:w="108" w:type="dxa"/>
+              <w:bottom w:w="60" w:type="dxa"/>
+              <w:right w:w="108" w:type="dxa"/>
+            </w:tcMar>
+            <w:vAlign w:val="center"/>
+          </w:tcPr>
+          <w:p>
+            <w:r>
+              <w:rPr>
+                <w:sz w:val="24"/>
+                <w:szCs w:val="24"/>
+              </w:rPr>
+              <w:t xml:space="preserve">FK_Promotions_Users</w:t>
+            </w:r>
+          </w:p>
+        </w:tc>
+        <w:tc>
+          <w:tcPr>
+            <w:tcW w:w="3000" w:type="dxa"/>
+            <w:tcBorders>
+              <w:top w:val="single" w:sz="4" w:space="0" w:color="000000"/>
+              <w:left w:val="single" w:sz="4" w:space="0" w:color="000000"/>
+              <w:bottom w:val="single" w:sz="4" w:space="0" w:color="000000"/>
+              <w:right w:val="single" w:sz="4" w:space="0" w:color="000000"/>
+            </w:tcBorders>
+            <w:shd w:val="clear" w:color="auto" w:fill="auto"/>
+            <w:tcMar>
+              <w:top w:w="60" w:type="dxa"/>
+              <w:left w:w="108" w:type="dxa"/>
+              <w:bottom w:w="60" w:type="dxa"/>
+              <w:right w:w="108" w:type="dxa"/>
+            </w:tcMar>
+            <w:vAlign w:val="center"/>
+          </w:tcPr>
+          <w:p>
+            <w:r>
+              <w:rPr>
+                <w:sz w:val="24"/>
+                <w:szCs w:val="24"/>
+              </w:rPr>
+              <w:t xml:space="preserve">Promotions(CreatedByUserId)</w:t>
+            </w:r>
+          </w:p>
+        </w:tc>
+        <w:tc>
+          <w:tcPr>
+            <w:tcW w:w="3154" w:type="dxa"/>
+            <w:tcBorders>
+              <w:top w:val="single" w:sz="4" w:space="0" w:color="000000"/>
+              <w:left w:val="single" w:sz="4" w:space="0" w:color="000000"/>
+              <w:bottom w:val="single" w:sz="4" w:space="0" w:color="000000"/>
+              <w:right w:val="single" w:sz="4" w:space="0" w:color="000000"/>
+            </w:tcBorders>
+            <w:shd w:val="clear" w:color="auto" w:fill="auto"/>
+            <w:tcMar>
+              <w:top w:w="60" w:type="dxa"/>
+              <w:left w:w="108" w:type="dxa"/>
+              <w:bottom w:w="60" w:type="dxa"/>
+              <w:right w:w="108" w:type="dxa"/>
+            </w:tcMar>
+            <w:vAlign w:val="center"/>
+          </w:tcPr>
+          <w:p>
+            <w:r>
+              <w:rPr>
+                <w:sz w:val="24"/>
+                <w:szCs w:val="24"/>
+              </w:rPr>
+              <w:t xml:space="preserve">Users(UserId)</w:t>
+            </w:r>
+          </w:p>
+        </w:tc>
+      </w:tr>
     </w:tbl>
     <w:p>
       <w:pPr>
@@ -12707,7 +13743,7 @@
         <w:jc w:val="both"/>
       </w:pPr>
       <w:r>
-        <w:t xml:space="preserve">Параметризованные запросы находятся в sql/04_Queries.sql. Они охватывают регистрацию, вход, создание, проверку и удаление сессии, дату последнего входа, а также выборки каталога и заказов. Значения передаются через параметры mssql, а не формируются конкатенацией строк.</w:t>
+        <w:t xml:space="preserve">Параметризованные запросы находятся в sql/04_Queries.sql. Четырнадцать сценариев охватывают регистрацию, вход, сессии, каталог, создание и просмотр заказов, изменение статуса, чтение и добавление акций. Значения передаются через параметры mssql.</w:t>
       </w:r>
     </w:p>
     <w:tbl>
@@ -13763,6 +14799,374 @@
           </w:p>
         </w:tc>
       </w:tr>
+      <w:tr>
+        <w:tblPrEx>
+          <w:tblCellMar>
+            <w:top w:w="0" w:type="dxa"/>
+            <w:bottom w:w="0" w:type="dxa"/>
+          </w:tblCellMar>
+        </w:tblPrEx>
+        <w:tc>
+          <w:tcPr>
+            <w:tcW w:w="500" w:type="dxa"/>
+            <w:tcBorders>
+              <w:top w:val="single" w:sz="4" w:space="0" w:color="000000"/>
+              <w:left w:val="single" w:sz="4" w:space="0" w:color="000000"/>
+              <w:bottom w:val="single" w:sz="4" w:space="0" w:color="000000"/>
+              <w:right w:val="single" w:sz="4" w:space="0" w:color="000000"/>
+            </w:tcBorders>
+            <w:shd w:val="clear" w:color="auto" w:fill="auto"/>
+            <w:tcMar>
+              <w:top w:w="60" w:type="dxa"/>
+              <w:left w:w="108" w:type="dxa"/>
+              <w:bottom w:w="60" w:type="dxa"/>
+              <w:right w:w="108" w:type="dxa"/>
+            </w:tcMar>
+            <w:vAlign w:val="center"/>
+          </w:tcPr>
+          <w:p>
+            <w:r>
+              <w:rPr>
+                <w:sz w:val="24"/>
+                <w:szCs w:val="24"/>
+              </w:rPr>
+              <w:t xml:space="preserve">11</w:t>
+            </w:r>
+          </w:p>
+        </w:tc>
+        <w:tc>
+          <w:tcPr>
+            <w:tcW w:w="3600" w:type="dxa"/>
+            <w:tcBorders>
+              <w:top w:val="single" w:sz="4" w:space="0" w:color="000000"/>
+              <w:left w:val="single" w:sz="4" w:space="0" w:color="000000"/>
+              <w:bottom w:val="single" w:sz="4" w:space="0" w:color="000000"/>
+              <w:right w:val="single" w:sz="4" w:space="0" w:color="000000"/>
+            </w:tcBorders>
+            <w:shd w:val="clear" w:color="auto" w:fill="auto"/>
+            <w:tcMar>
+              <w:top w:w="60" w:type="dxa"/>
+              <w:left w:w="108" w:type="dxa"/>
+              <w:bottom w:w="60" w:type="dxa"/>
+              <w:right w:w="108" w:type="dxa"/>
+            </w:tcMar>
+            <w:vAlign w:val="center"/>
+          </w:tcPr>
+          <w:p>
+            <w:r>
+              <w:rPr>
+                <w:sz w:val="24"/>
+                <w:szCs w:val="24"/>
+              </w:rPr>
+              <w:t xml:space="preserve">Получить все заказы</w:t>
+            </w:r>
+          </w:p>
+        </w:tc>
+        <w:tc>
+          <w:tcPr>
+            <w:tcW w:w="5054" w:type="dxa"/>
+            <w:tcBorders>
+              <w:top w:val="single" w:sz="4" w:space="0" w:color="000000"/>
+              <w:left w:val="single" w:sz="4" w:space="0" w:color="000000"/>
+              <w:bottom w:val="single" w:sz="4" w:space="0" w:color="000000"/>
+              <w:right w:val="single" w:sz="4" w:space="0" w:color="000000"/>
+            </w:tcBorders>
+            <w:shd w:val="clear" w:color="auto" w:fill="auto"/>
+            <w:tcMar>
+              <w:top w:w="60" w:type="dxa"/>
+              <w:left w:w="108" w:type="dxa"/>
+              <w:bottom w:w="60" w:type="dxa"/>
+              <w:right w:w="108" w:type="dxa"/>
+            </w:tcMar>
+            <w:vAlign w:val="center"/>
+          </w:tcPr>
+          <w:p>
+            <w:r>
+              <w:rPr>
+                <w:sz w:val="24"/>
+                <w:szCs w:val="24"/>
+              </w:rPr>
+              <w:t xml:space="preserve">роль admin</w:t>
+            </w:r>
+          </w:p>
+        </w:tc>
+      </w:tr>
+      <w:tr>
+        <w:tblPrEx>
+          <w:tblCellMar>
+            <w:top w:w="0" w:type="dxa"/>
+            <w:bottom w:w="0" w:type="dxa"/>
+          </w:tblCellMar>
+        </w:tblPrEx>
+        <w:tc>
+          <w:tcPr>
+            <w:tcW w:w="500" w:type="dxa"/>
+            <w:tcBorders>
+              <w:top w:val="single" w:sz="4" w:space="0" w:color="000000"/>
+              <w:left w:val="single" w:sz="4" w:space="0" w:color="000000"/>
+              <w:bottom w:val="single" w:sz="4" w:space="0" w:color="000000"/>
+              <w:right w:val="single" w:sz="4" w:space="0" w:color="000000"/>
+            </w:tcBorders>
+            <w:shd w:val="clear" w:color="auto" w:fill="auto"/>
+            <w:tcMar>
+              <w:top w:w="60" w:type="dxa"/>
+              <w:left w:w="108" w:type="dxa"/>
+              <w:bottom w:w="60" w:type="dxa"/>
+              <w:right w:w="108" w:type="dxa"/>
+            </w:tcMar>
+            <w:vAlign w:val="center"/>
+          </w:tcPr>
+          <w:p>
+            <w:r>
+              <w:rPr>
+                <w:sz w:val="24"/>
+                <w:szCs w:val="24"/>
+              </w:rPr>
+              <w:t xml:space="preserve">12</w:t>
+            </w:r>
+          </w:p>
+        </w:tc>
+        <w:tc>
+          <w:tcPr>
+            <w:tcW w:w="3600" w:type="dxa"/>
+            <w:tcBorders>
+              <w:top w:val="single" w:sz="4" w:space="0" w:color="000000"/>
+              <w:left w:val="single" w:sz="4" w:space="0" w:color="000000"/>
+              <w:bottom w:val="single" w:sz="4" w:space="0" w:color="000000"/>
+              <w:right w:val="single" w:sz="4" w:space="0" w:color="000000"/>
+            </w:tcBorders>
+            <w:shd w:val="clear" w:color="auto" w:fill="auto"/>
+            <w:tcMar>
+              <w:top w:w="60" w:type="dxa"/>
+              <w:left w:w="108" w:type="dxa"/>
+              <w:bottom w:w="60" w:type="dxa"/>
+              <w:right w:w="108" w:type="dxa"/>
+            </w:tcMar>
+            <w:vAlign w:val="center"/>
+          </w:tcPr>
+          <w:p>
+            <w:r>
+              <w:rPr>
+                <w:sz w:val="24"/>
+                <w:szCs w:val="24"/>
+              </w:rPr>
+              <w:t xml:space="preserve">Изменить статус заказа</w:t>
+            </w:r>
+          </w:p>
+        </w:tc>
+        <w:tc>
+          <w:tcPr>
+            <w:tcW w:w="5054" w:type="dxa"/>
+            <w:tcBorders>
+              <w:top w:val="single" w:sz="4" w:space="0" w:color="000000"/>
+              <w:left w:val="single" w:sz="4" w:space="0" w:color="000000"/>
+              <w:bottom w:val="single" w:sz="4" w:space="0" w:color="000000"/>
+              <w:right w:val="single" w:sz="4" w:space="0" w:color="000000"/>
+            </w:tcBorders>
+            <w:shd w:val="clear" w:color="auto" w:fill="auto"/>
+            <w:tcMar>
+              <w:top w:w="60" w:type="dxa"/>
+              <w:left w:w="108" w:type="dxa"/>
+              <w:bottom w:w="60" w:type="dxa"/>
+              <w:right w:w="108" w:type="dxa"/>
+            </w:tcMar>
+            <w:vAlign w:val="center"/>
+          </w:tcPr>
+          <w:p>
+            <w:r>
+              <w:rPr>
+                <w:sz w:val="24"/>
+                <w:szCs w:val="24"/>
+              </w:rPr>
+              <w:t xml:space="preserve">@OrderId, @Status</w:t>
+            </w:r>
+          </w:p>
+        </w:tc>
+      </w:tr>
+      <w:tr>
+        <w:tblPrEx>
+          <w:tblCellMar>
+            <w:top w:w="0" w:type="dxa"/>
+            <w:bottom w:w="0" w:type="dxa"/>
+          </w:tblCellMar>
+        </w:tblPrEx>
+        <w:tc>
+          <w:tcPr>
+            <w:tcW w:w="500" w:type="dxa"/>
+            <w:tcBorders>
+              <w:top w:val="single" w:sz="4" w:space="0" w:color="000000"/>
+              <w:left w:val="single" w:sz="4" w:space="0" w:color="000000"/>
+              <w:bottom w:val="single" w:sz="4" w:space="0" w:color="000000"/>
+              <w:right w:val="single" w:sz="4" w:space="0" w:color="000000"/>
+            </w:tcBorders>
+            <w:shd w:val="clear" w:color="auto" w:fill="auto"/>
+            <w:tcMar>
+              <w:top w:w="60" w:type="dxa"/>
+              <w:left w:w="108" w:type="dxa"/>
+              <w:bottom w:w="60" w:type="dxa"/>
+              <w:right w:w="108" w:type="dxa"/>
+            </w:tcMar>
+            <w:vAlign w:val="center"/>
+          </w:tcPr>
+          <w:p>
+            <w:r>
+              <w:rPr>
+                <w:sz w:val="24"/>
+                <w:szCs w:val="24"/>
+              </w:rPr>
+              <w:t xml:space="preserve">13</w:t>
+            </w:r>
+          </w:p>
+        </w:tc>
+        <w:tc>
+          <w:tcPr>
+            <w:tcW w:w="3600" w:type="dxa"/>
+            <w:tcBorders>
+              <w:top w:val="single" w:sz="4" w:space="0" w:color="000000"/>
+              <w:left w:val="single" w:sz="4" w:space="0" w:color="000000"/>
+              <w:bottom w:val="single" w:sz="4" w:space="0" w:color="000000"/>
+              <w:right w:val="single" w:sz="4" w:space="0" w:color="000000"/>
+            </w:tcBorders>
+            <w:shd w:val="clear" w:color="auto" w:fill="auto"/>
+            <w:tcMar>
+              <w:top w:w="60" w:type="dxa"/>
+              <w:left w:w="108" w:type="dxa"/>
+              <w:bottom w:w="60" w:type="dxa"/>
+              <w:right w:w="108" w:type="dxa"/>
+            </w:tcMar>
+            <w:vAlign w:val="center"/>
+          </w:tcPr>
+          <w:p>
+            <w:r>
+              <w:rPr>
+                <w:sz w:val="24"/>
+                <w:szCs w:val="24"/>
+              </w:rPr>
+              <w:t xml:space="preserve">Получить действующие акции</w:t>
+            </w:r>
+          </w:p>
+        </w:tc>
+        <w:tc>
+          <w:tcPr>
+            <w:tcW w:w="5054" w:type="dxa"/>
+            <w:tcBorders>
+              <w:top w:val="single" w:sz="4" w:space="0" w:color="000000"/>
+              <w:left w:val="single" w:sz="4" w:space="0" w:color="000000"/>
+              <w:bottom w:val="single" w:sz="4" w:space="0" w:color="000000"/>
+              <w:right w:val="single" w:sz="4" w:space="0" w:color="000000"/>
+            </w:tcBorders>
+            <w:shd w:val="clear" w:color="auto" w:fill="auto"/>
+            <w:tcMar>
+              <w:top w:w="60" w:type="dxa"/>
+              <w:left w:w="108" w:type="dxa"/>
+              <w:bottom w:w="60" w:type="dxa"/>
+              <w:right w:w="108" w:type="dxa"/>
+            </w:tcMar>
+            <w:vAlign w:val="center"/>
+          </w:tcPr>
+          <w:p>
+            <w:r>
+              <w:rPr>
+                <w:sz w:val="24"/>
+                <w:szCs w:val="24"/>
+              </w:rPr>
+              <w:t xml:space="preserve">IsActive</w:t>
+            </w:r>
+          </w:p>
+        </w:tc>
+      </w:tr>
+      <w:tr>
+        <w:tblPrEx>
+          <w:tblCellMar>
+            <w:top w:w="0" w:type="dxa"/>
+            <w:bottom w:w="0" w:type="dxa"/>
+          </w:tblCellMar>
+        </w:tblPrEx>
+        <w:tc>
+          <w:tcPr>
+            <w:tcW w:w="500" w:type="dxa"/>
+            <w:tcBorders>
+              <w:top w:val="single" w:sz="4" w:space="0" w:color="000000"/>
+              <w:left w:val="single" w:sz="4" w:space="0" w:color="000000"/>
+              <w:bottom w:val="single" w:sz="4" w:space="0" w:color="000000"/>
+              <w:right w:val="single" w:sz="4" w:space="0" w:color="000000"/>
+            </w:tcBorders>
+            <w:shd w:val="clear" w:color="auto" w:fill="auto"/>
+            <w:tcMar>
+              <w:top w:w="60" w:type="dxa"/>
+              <w:left w:w="108" w:type="dxa"/>
+              <w:bottom w:w="60" w:type="dxa"/>
+              <w:right w:w="108" w:type="dxa"/>
+            </w:tcMar>
+            <w:vAlign w:val="center"/>
+          </w:tcPr>
+          <w:p>
+            <w:r>
+              <w:rPr>
+                <w:sz w:val="24"/>
+                <w:szCs w:val="24"/>
+              </w:rPr>
+              <w:t xml:space="preserve">14</w:t>
+            </w:r>
+          </w:p>
+        </w:tc>
+        <w:tc>
+          <w:tcPr>
+            <w:tcW w:w="3600" w:type="dxa"/>
+            <w:tcBorders>
+              <w:top w:val="single" w:sz="4" w:space="0" w:color="000000"/>
+              <w:left w:val="single" w:sz="4" w:space="0" w:color="000000"/>
+              <w:bottom w:val="single" w:sz="4" w:space="0" w:color="000000"/>
+              <w:right w:val="single" w:sz="4" w:space="0" w:color="000000"/>
+            </w:tcBorders>
+            <w:shd w:val="clear" w:color="auto" w:fill="auto"/>
+            <w:tcMar>
+              <w:top w:w="60" w:type="dxa"/>
+              <w:left w:w="108" w:type="dxa"/>
+              <w:bottom w:w="60" w:type="dxa"/>
+              <w:right w:w="108" w:type="dxa"/>
+            </w:tcMar>
+            <w:vAlign w:val="center"/>
+          </w:tcPr>
+          <w:p>
+            <w:r>
+              <w:rPr>
+                <w:sz w:val="24"/>
+                <w:szCs w:val="24"/>
+              </w:rPr>
+              <w:t xml:space="preserve">Добавить акцию</w:t>
+            </w:r>
+          </w:p>
+        </w:tc>
+        <w:tc>
+          <w:tcPr>
+            <w:tcW w:w="5054" w:type="dxa"/>
+            <w:tcBorders>
+              <w:top w:val="single" w:sz="4" w:space="0" w:color="000000"/>
+              <w:left w:val="single" w:sz="4" w:space="0" w:color="000000"/>
+              <w:bottom w:val="single" w:sz="4" w:space="0" w:color="000000"/>
+              <w:right w:val="single" w:sz="4" w:space="0" w:color="000000"/>
+            </w:tcBorders>
+            <w:shd w:val="clear" w:color="auto" w:fill="auto"/>
+            <w:tcMar>
+              <w:top w:w="60" w:type="dxa"/>
+              <w:left w:w="108" w:type="dxa"/>
+              <w:bottom w:w="60" w:type="dxa"/>
+              <w:right w:w="108" w:type="dxa"/>
+            </w:tcMar>
+            <w:vAlign w:val="center"/>
+          </w:tcPr>
+          <w:p>
+            <w:r>
+              <w:rPr>
+                <w:sz w:val="24"/>
+                <w:szCs w:val="24"/>
+              </w:rPr>
+              <w:t xml:space="preserve">@Title, @DateLabel, @UserId</w:t>
+            </w:r>
+          </w:p>
+        </w:tc>
+      </w:tr>
     </w:tbl>
     <w:p>
       <w:pPr>
@@ -13824,7 +15228,7 @@
         <w:jc w:val="both"/>
       </w:pPr>
       <w:r>
-        <w:t xml:space="preserve">Реализована база CybertagShop в Microsoft SQL Server 2022 Express, содержащая 8 взаимосвязанных таблиц. Целостность обеспечивается первичными и внешними ключами, CHECK-, UNIQUE- и DEFAULT-ограничениями. Подготовлены скрипты схемы, тестовых данных, 10 параметризованных запросов, 5 представлений, 4 процедуры и 3 функции.</w:t>
+        <w:t xml:space="preserve">Реализована база CybertagShop в Microsoft SQL Server 2022 Express, содержащая 9 взаимосвязанных таблиц. Целостность обеспечивается первичными и внешними ключами, CHECK-, UNIQUE- и DEFAULT-ограничениями. Подготовлены скрипты схемы, тестовых данных, 14 параметризованных сценариев запросов, 5 представлений, 4 процедуры и 3 функции.</w:t>
       </w:r>
     </w:p>
     <w:p>
@@ -13834,7 +15238,7 @@
         <w:jc w:val="both"/>
       </w:pPr>
       <w:r>
-        <w:t xml:space="preserve">Реализован REST API Node.js/Express с подключением через mssql/msnodesqlv8. Регистрация сохраняет Customers и Users в транзакции, пароли хэшируются bcrypt, а серверные сессии хранятся в Sessions. Клиентская часть сохранила существующие HTML, CSS и Vanilla JavaScript, корзину и форму контактов.</w:t>
+        <w:t xml:space="preserve">Реализован REST API Node.js/Express с подключением через mssql/msnodesqlv8. Регистрация сохраняет Customers и Users, заказы — Orders и OrderItems, акции — Promotions, а сессии — Sessions. Панель manager защищена проверкой роли admin.</w:t>
       </w:r>
     </w:p>
     <w:p>
@@ -16561,7 +17965,7 @@
           <w:b/>
           <w:bCs/>
         </w:rPr>
-        <w:t xml:space="preserve">В.3 Регистрация и личный кабинет</w:t>
+        <w:t xml:space="preserve">В.3 Панель администратора</w:t>
       </w:r>
     </w:p>
     <w:p>
@@ -16571,7 +17975,7 @@
         <w:jc w:val="both"/>
       </w:pPr>
       <w:r>
-        <w:t xml:space="preserve">Страница регистрации содержит имя, логин, email, пароль и подтверждение. После успешной транзакции пользователь автоматически получает серверную сессию. В личном кабинете отображаются имя пользователя, корзина, локальные заявки и кнопка выхода.</w:t>
+        <w:t xml:space="preserve">Панель администратора содержит форму добавления акции, список действующих акций и таблицу всех заказов. Для каждого заказа отображаются клиент, состав, сумма и раскрывающийся список статуса. Доступ разрешён только роли admin.</w:t>
       </w:r>
     </w:p>
     <w:tbl>
@@ -17290,7 +18694,7 @@
                 <w:sz w:val="24"/>
                 <w:szCs w:val="24"/>
               </w:rPr>
-              <w:t xml:space="preserve">Сервер недоступен</w:t>
+              <w:t xml:space="preserve">Нет прав администратора</w:t>
             </w:r>
           </w:p>
         </w:tc>
@@ -17318,7 +18722,7 @@
                 <w:sz w:val="24"/>
                 <w:szCs w:val="24"/>
               </w:rPr>
-              <w:t xml:space="preserve">Сервер авторизации недоступен.</w:t>
+              <w:t xml:space="preserve">Недостаточно прав.</w:t>
             </w:r>
           </w:p>
         </w:tc>
@@ -17346,7 +18750,7 @@
                 <w:sz w:val="24"/>
                 <w:szCs w:val="24"/>
               </w:rPr>
-              <w:t xml:space="preserve">Ошибка</w:t>
+              <w:t xml:space="preserve">Ошибка 403</w:t>
             </w:r>
           </w:p>
         </w:tc>
@@ -17382,6 +18786,282 @@
                 <w:sz w:val="24"/>
                 <w:szCs w:val="24"/>
               </w:rPr>
+              <w:t xml:space="preserve">Заказ оформлен</w:t>
+            </w:r>
+          </w:p>
+        </w:tc>
+        <w:tc>
+          <w:tcPr>
+            <w:tcW w:w="3500" w:type="dxa"/>
+            <w:tcBorders>
+              <w:top w:val="single" w:sz="4" w:space="0" w:color="000000"/>
+              <w:left w:val="single" w:sz="4" w:space="0" w:color="000000"/>
+              <w:bottom w:val="single" w:sz="4" w:space="0" w:color="000000"/>
+              <w:right w:val="single" w:sz="4" w:space="0" w:color="000000"/>
+            </w:tcBorders>
+            <w:shd w:val="clear" w:color="auto" w:fill="auto"/>
+            <w:tcMar>
+              <w:top w:w="60" w:type="dxa"/>
+              <w:left w:w="108" w:type="dxa"/>
+              <w:bottom w:w="60" w:type="dxa"/>
+              <w:right w:w="108" w:type="dxa"/>
+            </w:tcMar>
+            <w:vAlign w:val="center"/>
+          </w:tcPr>
+          <w:p>
+            <w:r>
+              <w:rPr>
+                <w:sz w:val="24"/>
+                <w:szCs w:val="24"/>
+              </w:rPr>
+              <w:t xml:space="preserve">Заказ №N сохранён.</w:t>
+            </w:r>
+          </w:p>
+        </w:tc>
+        <w:tc>
+          <w:tcPr>
+            <w:tcW w:w="2854" w:type="dxa"/>
+            <w:tcBorders>
+              <w:top w:val="single" w:sz="4" w:space="0" w:color="000000"/>
+              <w:left w:val="single" w:sz="4" w:space="0" w:color="000000"/>
+              <w:bottom w:val="single" w:sz="4" w:space="0" w:color="000000"/>
+              <w:right w:val="single" w:sz="4" w:space="0" w:color="000000"/>
+            </w:tcBorders>
+            <w:shd w:val="clear" w:color="auto" w:fill="auto"/>
+            <w:tcMar>
+              <w:top w:w="60" w:type="dxa"/>
+              <w:left w:w="108" w:type="dxa"/>
+              <w:bottom w:w="60" w:type="dxa"/>
+              <w:right w:w="108" w:type="dxa"/>
+            </w:tcMar>
+            <w:vAlign w:val="center"/>
+          </w:tcPr>
+          <w:p>
+            <w:r>
+              <w:rPr>
+                <w:sz w:val="24"/>
+                <w:szCs w:val="24"/>
+              </w:rPr>
+              <w:t xml:space="preserve">Успех 201</w:t>
+            </w:r>
+          </w:p>
+        </w:tc>
+      </w:tr>
+      <w:tr>
+        <w:tblPrEx>
+          <w:tblCellMar>
+            <w:top w:w="0" w:type="dxa"/>
+            <w:bottom w:w="0" w:type="dxa"/>
+          </w:tblCellMar>
+        </w:tblPrEx>
+        <w:tc>
+          <w:tcPr>
+            <w:tcW w:w="2800" w:type="dxa"/>
+            <w:tcBorders>
+              <w:top w:val="single" w:sz="4" w:space="0" w:color="000000"/>
+              <w:left w:val="single" w:sz="4" w:space="0" w:color="000000"/>
+              <w:bottom w:val="single" w:sz="4" w:space="0" w:color="000000"/>
+              <w:right w:val="single" w:sz="4" w:space="0" w:color="000000"/>
+            </w:tcBorders>
+            <w:shd w:val="clear" w:color="auto" w:fill="auto"/>
+            <w:tcMar>
+              <w:top w:w="60" w:type="dxa"/>
+              <w:left w:w="108" w:type="dxa"/>
+              <w:bottom w:w="60" w:type="dxa"/>
+              <w:right w:w="108" w:type="dxa"/>
+            </w:tcMar>
+            <w:vAlign w:val="center"/>
+          </w:tcPr>
+          <w:p>
+            <w:r>
+              <w:rPr>
+                <w:sz w:val="24"/>
+                <w:szCs w:val="24"/>
+              </w:rPr>
+              <w:t xml:space="preserve">Акция добавлена</w:t>
+            </w:r>
+          </w:p>
+        </w:tc>
+        <w:tc>
+          <w:tcPr>
+            <w:tcW w:w="3500" w:type="dxa"/>
+            <w:tcBorders>
+              <w:top w:val="single" w:sz="4" w:space="0" w:color="000000"/>
+              <w:left w:val="single" w:sz="4" w:space="0" w:color="000000"/>
+              <w:bottom w:val="single" w:sz="4" w:space="0" w:color="000000"/>
+              <w:right w:val="single" w:sz="4" w:space="0" w:color="000000"/>
+            </w:tcBorders>
+            <w:shd w:val="clear" w:color="auto" w:fill="auto"/>
+            <w:tcMar>
+              <w:top w:w="60" w:type="dxa"/>
+              <w:left w:w="108" w:type="dxa"/>
+              <w:bottom w:w="60" w:type="dxa"/>
+              <w:right w:w="108" w:type="dxa"/>
+            </w:tcMar>
+            <w:vAlign w:val="center"/>
+          </w:tcPr>
+          <w:p>
+            <w:r>
+              <w:rPr>
+                <w:sz w:val="24"/>
+                <w:szCs w:val="24"/>
+              </w:rPr>
+              <w:t xml:space="preserve">Акция добавлена.</w:t>
+            </w:r>
+          </w:p>
+        </w:tc>
+        <w:tc>
+          <w:tcPr>
+            <w:tcW w:w="2854" w:type="dxa"/>
+            <w:tcBorders>
+              <w:top w:val="single" w:sz="4" w:space="0" w:color="000000"/>
+              <w:left w:val="single" w:sz="4" w:space="0" w:color="000000"/>
+              <w:bottom w:val="single" w:sz="4" w:space="0" w:color="000000"/>
+              <w:right w:val="single" w:sz="4" w:space="0" w:color="000000"/>
+            </w:tcBorders>
+            <w:shd w:val="clear" w:color="auto" w:fill="auto"/>
+            <w:tcMar>
+              <w:top w:w="60" w:type="dxa"/>
+              <w:left w:w="108" w:type="dxa"/>
+              <w:bottom w:w="60" w:type="dxa"/>
+              <w:right w:w="108" w:type="dxa"/>
+            </w:tcMar>
+            <w:vAlign w:val="center"/>
+          </w:tcPr>
+          <w:p>
+            <w:r>
+              <w:rPr>
+                <w:sz w:val="24"/>
+                <w:szCs w:val="24"/>
+              </w:rPr>
+              <w:t xml:space="preserve">Успех 201</w:t>
+            </w:r>
+          </w:p>
+        </w:tc>
+      </w:tr>
+      <w:tr>
+        <w:tblPrEx>
+          <w:tblCellMar>
+            <w:top w:w="0" w:type="dxa"/>
+            <w:bottom w:w="0" w:type="dxa"/>
+          </w:tblCellMar>
+        </w:tblPrEx>
+        <w:tc>
+          <w:tcPr>
+            <w:tcW w:w="2800" w:type="dxa"/>
+            <w:tcBorders>
+              <w:top w:val="single" w:sz="4" w:space="0" w:color="000000"/>
+              <w:left w:val="single" w:sz="4" w:space="0" w:color="000000"/>
+              <w:bottom w:val="single" w:sz="4" w:space="0" w:color="000000"/>
+              <w:right w:val="single" w:sz="4" w:space="0" w:color="000000"/>
+            </w:tcBorders>
+            <w:shd w:val="clear" w:color="auto" w:fill="auto"/>
+            <w:tcMar>
+              <w:top w:w="60" w:type="dxa"/>
+              <w:left w:w="108" w:type="dxa"/>
+              <w:bottom w:w="60" w:type="dxa"/>
+              <w:right w:w="108" w:type="dxa"/>
+            </w:tcMar>
+            <w:vAlign w:val="center"/>
+          </w:tcPr>
+          <w:p>
+            <w:r>
+              <w:rPr>
+                <w:sz w:val="24"/>
+                <w:szCs w:val="24"/>
+              </w:rPr>
+              <w:t xml:space="preserve">Сервер недоступен</w:t>
+            </w:r>
+          </w:p>
+        </w:tc>
+        <w:tc>
+          <w:tcPr>
+            <w:tcW w:w="3500" w:type="dxa"/>
+            <w:tcBorders>
+              <w:top w:val="single" w:sz="4" w:space="0" w:color="000000"/>
+              <w:left w:val="single" w:sz="4" w:space="0" w:color="000000"/>
+              <w:bottom w:val="single" w:sz="4" w:space="0" w:color="000000"/>
+              <w:right w:val="single" w:sz="4" w:space="0" w:color="000000"/>
+            </w:tcBorders>
+            <w:shd w:val="clear" w:color="auto" w:fill="auto"/>
+            <w:tcMar>
+              <w:top w:w="60" w:type="dxa"/>
+              <w:left w:w="108" w:type="dxa"/>
+              <w:bottom w:w="60" w:type="dxa"/>
+              <w:right w:w="108" w:type="dxa"/>
+            </w:tcMar>
+            <w:vAlign w:val="center"/>
+          </w:tcPr>
+          <w:p>
+            <w:r>
+              <w:rPr>
+                <w:sz w:val="24"/>
+                <w:szCs w:val="24"/>
+              </w:rPr>
+              <w:t xml:space="preserve">Сервер авторизации недоступен.</w:t>
+            </w:r>
+          </w:p>
+        </w:tc>
+        <w:tc>
+          <w:tcPr>
+            <w:tcW w:w="2854" w:type="dxa"/>
+            <w:tcBorders>
+              <w:top w:val="single" w:sz="4" w:space="0" w:color="000000"/>
+              <w:left w:val="single" w:sz="4" w:space="0" w:color="000000"/>
+              <w:bottom w:val="single" w:sz="4" w:space="0" w:color="000000"/>
+              <w:right w:val="single" w:sz="4" w:space="0" w:color="000000"/>
+            </w:tcBorders>
+            <w:shd w:val="clear" w:color="auto" w:fill="auto"/>
+            <w:tcMar>
+              <w:top w:w="60" w:type="dxa"/>
+              <w:left w:w="108" w:type="dxa"/>
+              <w:bottom w:w="60" w:type="dxa"/>
+              <w:right w:w="108" w:type="dxa"/>
+            </w:tcMar>
+            <w:vAlign w:val="center"/>
+          </w:tcPr>
+          <w:p>
+            <w:r>
+              <w:rPr>
+                <w:sz w:val="24"/>
+                <w:szCs w:val="24"/>
+              </w:rPr>
+              <w:t xml:space="preserve">Ошибка</w:t>
+            </w:r>
+          </w:p>
+        </w:tc>
+      </w:tr>
+      <w:tr>
+        <w:tblPrEx>
+          <w:tblCellMar>
+            <w:top w:w="0" w:type="dxa"/>
+            <w:bottom w:w="0" w:type="dxa"/>
+          </w:tblCellMar>
+        </w:tblPrEx>
+        <w:tc>
+          <w:tcPr>
+            <w:tcW w:w="2800" w:type="dxa"/>
+            <w:tcBorders>
+              <w:top w:val="single" w:sz="4" w:space="0" w:color="000000"/>
+              <w:left w:val="single" w:sz="4" w:space="0" w:color="000000"/>
+              <w:bottom w:val="single" w:sz="4" w:space="0" w:color="000000"/>
+              <w:right w:val="single" w:sz="4" w:space="0" w:color="000000"/>
+            </w:tcBorders>
+            <w:shd w:val="clear" w:color="auto" w:fill="auto"/>
+            <w:tcMar>
+              <w:top w:w="60" w:type="dxa"/>
+              <w:left w:w="108" w:type="dxa"/>
+              <w:bottom w:w="60" w:type="dxa"/>
+              <w:right w:w="108" w:type="dxa"/>
+            </w:tcMar>
+            <w:vAlign w:val="center"/>
+          </w:tcPr>
+          <w:p>
+            <w:r>
+              <w:rPr>
+                <w:sz w:val="24"/>
+                <w:szCs w:val="24"/>
+              </w:rPr>
               <w:t xml:space="preserve">Выход</w:t>
             </w:r>
           </w:p>
@@ -17527,7 +19207,7 @@
         <w:jc w:val="both"/>
       </w:pPr>
       <w:r>
-        <w:t xml:space="preserve">Первое звено — браузер с HTML/CSS/JavaScript и HttpOnly cookie. Второе — Node.js/Express: валидация, bcrypt, управление сессиями и параметризованные запросы. Третье — Microsoft SQL Server 2022 Express: Customers, Users, Sessions и предметные таблицы.</w:t>
+        <w:t xml:space="preserve">Первое звено — браузер с HTML/CSS/JavaScript и HttpOnly cookie. Второе — Node.js/Express: валидация, bcrypt, проверка роли, API заказов и акций. Третье — Microsoft SQL Server 2022 Express: Customers, Users, Sessions, Orders, OrderItems и Promotions.</w:t>
       </w:r>
     </w:p>
     <w:tbl>
@@ -17850,7 +19530,7 @@
                 <w:sz w:val="24"/>
                 <w:szCs w:val="24"/>
               </w:rPr>
-              <w:t xml:space="preserve">Валидация, API, сессии</w:t>
+              <w:t xml:space="preserve">Валидация, роли, API, сессии</w:t>
             </w:r>
           </w:p>
         </w:tc>
@@ -17942,7 +19622,7 @@
                 <w:sz w:val="24"/>
                 <w:szCs w:val="24"/>
               </w:rPr>
-              <w:t xml:space="preserve">Users, Sessions и предметная модель</w:t>
+              <w:t xml:space="preserve">Users, Sessions, Orders, Promotions</w:t>
             </w:r>
           </w:p>
         </w:tc>
@@ -19346,6 +21026,154 @@
                 <w:szCs w:val="24"/>
               </w:rPr>
               <w:t xml:space="preserve">Серверные сессии</w:t>
+            </w:r>
+          </w:p>
+        </w:tc>
+      </w:tr>
+      <w:tr>
+        <w:tblPrEx>
+          <w:tblCellMar>
+            <w:top w:w="0" w:type="dxa"/>
+            <w:bottom w:w="0" w:type="dxa"/>
+          </w:tblCellMar>
+        </w:tblPrEx>
+        <w:tc>
+          <w:tcPr>
+            <w:tcW w:w="2000" w:type="dxa"/>
+            <w:tcBorders>
+              <w:top w:val="single" w:sz="4" w:space="0" w:color="000000"/>
+              <w:left w:val="single" w:sz="4" w:space="0" w:color="000000"/>
+              <w:bottom w:val="single" w:sz="4" w:space="0" w:color="000000"/>
+              <w:right w:val="single" w:sz="4" w:space="0" w:color="000000"/>
+            </w:tcBorders>
+            <w:shd w:val="clear" w:color="auto" w:fill="auto"/>
+            <w:tcMar>
+              <w:top w:w="60" w:type="dxa"/>
+              <w:left w:w="108" w:type="dxa"/>
+              <w:bottom w:w="60" w:type="dxa"/>
+              <w:right w:w="108" w:type="dxa"/>
+            </w:tcMar>
+            <w:vAlign w:val="center"/>
+          </w:tcPr>
+          <w:p>
+            <w:r>
+              <w:rPr>
+                <w:sz w:val="24"/>
+                <w:szCs w:val="24"/>
+              </w:rPr>
+              <w:t xml:space="preserve">Users</w:t>
+            </w:r>
+          </w:p>
+        </w:tc>
+        <w:tc>
+          <w:tcPr>
+            <w:tcW w:w="800" w:type="dxa"/>
+            <w:tcBorders>
+              <w:top w:val="single" w:sz="4" w:space="0" w:color="000000"/>
+              <w:left w:val="single" w:sz="4" w:space="0" w:color="000000"/>
+              <w:bottom w:val="single" w:sz="4" w:space="0" w:color="000000"/>
+              <w:right w:val="single" w:sz="4" w:space="0" w:color="000000"/>
+            </w:tcBorders>
+            <w:shd w:val="clear" w:color="auto" w:fill="auto"/>
+            <w:tcMar>
+              <w:top w:w="60" w:type="dxa"/>
+              <w:left w:w="108" w:type="dxa"/>
+              <w:bottom w:w="60" w:type="dxa"/>
+              <w:right w:w="108" w:type="dxa"/>
+            </w:tcMar>
+            <w:vAlign w:val="center"/>
+          </w:tcPr>
+          <w:p>
+            <w:r>
+              <w:rPr>
+                <w:sz w:val="24"/>
+                <w:szCs w:val="24"/>
+              </w:rPr>
+              <w:t xml:space="preserve">1:N</w:t>
+            </w:r>
+          </w:p>
+        </w:tc>
+        <w:tc>
+          <w:tcPr>
+            <w:tcW w:w="2000" w:type="dxa"/>
+            <w:tcBorders>
+              <w:top w:val="single" w:sz="4" w:space="0" w:color="000000"/>
+              <w:left w:val="single" w:sz="4" w:space="0" w:color="000000"/>
+              <w:bottom w:val="single" w:sz="4" w:space="0" w:color="000000"/>
+              <w:right w:val="single" w:sz="4" w:space="0" w:color="000000"/>
+            </w:tcBorders>
+            <w:shd w:val="clear" w:color="auto" w:fill="auto"/>
+            <w:tcMar>
+              <w:top w:w="60" w:type="dxa"/>
+              <w:left w:w="108" w:type="dxa"/>
+              <w:bottom w:w="60" w:type="dxa"/>
+              <w:right w:w="108" w:type="dxa"/>
+            </w:tcMar>
+            <w:vAlign w:val="center"/>
+          </w:tcPr>
+          <w:p>
+            <w:r>
+              <w:rPr>
+                <w:sz w:val="24"/>
+                <w:szCs w:val="24"/>
+              </w:rPr>
+              <w:t xml:space="preserve">Promotions</w:t>
+            </w:r>
+          </w:p>
+        </w:tc>
+        <w:tc>
+          <w:tcPr>
+            <w:tcW w:w="1000" w:type="dxa"/>
+            <w:tcBorders>
+              <w:top w:val="single" w:sz="4" w:space="0" w:color="000000"/>
+              <w:left w:val="single" w:sz="4" w:space="0" w:color="000000"/>
+              <w:bottom w:val="single" w:sz="4" w:space="0" w:color="000000"/>
+              <w:right w:val="single" w:sz="4" w:space="0" w:color="000000"/>
+            </w:tcBorders>
+            <w:shd w:val="clear" w:color="auto" w:fill="auto"/>
+            <w:tcMar>
+              <w:top w:w="60" w:type="dxa"/>
+              <w:left w:w="108" w:type="dxa"/>
+              <w:bottom w:w="60" w:type="dxa"/>
+              <w:right w:w="108" w:type="dxa"/>
+            </w:tcMar>
+            <w:vAlign w:val="center"/>
+          </w:tcPr>
+          <w:p>
+            <w:r>
+              <w:rPr>
+                <w:sz w:val="24"/>
+                <w:szCs w:val="24"/>
+              </w:rPr>
+              <w:t xml:space="preserve">Нет</w:t>
+            </w:r>
+          </w:p>
+        </w:tc>
+        <w:tc>
+          <w:tcPr>
+            <w:tcW w:w="3354" w:type="dxa"/>
+            <w:tcBorders>
+              <w:top w:val="single" w:sz="4" w:space="0" w:color="000000"/>
+              <w:left w:val="single" w:sz="4" w:space="0" w:color="000000"/>
+              <w:bottom w:val="single" w:sz="4" w:space="0" w:color="000000"/>
+              <w:right w:val="single" w:sz="4" w:space="0" w:color="000000"/>
+            </w:tcBorders>
+            <w:shd w:val="clear" w:color="auto" w:fill="auto"/>
+            <w:tcMar>
+              <w:top w:w="60" w:type="dxa"/>
+              <w:left w:w="108" w:type="dxa"/>
+              <w:bottom w:w="60" w:type="dxa"/>
+              <w:right w:w="108" w:type="dxa"/>
+            </w:tcMar>
+            <w:vAlign w:val="center"/>
+          </w:tcPr>
+          <w:p>
+            <w:r>
+              <w:rPr>
+                <w:sz w:val="24"/>
+                <w:szCs w:val="24"/>
+              </w:rPr>
+              <w:t xml:space="preserve">Автор акции</w:t>
             </w:r>
           </w:p>
         </w:tc>

</xml_diff>

<commit_message>
Add promotion removal and protect admin page
</commit_message>
<xml_diff>
--- a/docs/Otchet_PM04_CYBERTAG_SQL.docx
+++ b/docs/Otchet_PM04_CYBERTAG_SQL.docx
@@ -2110,7 +2110,7 @@
         <w:jc w:val="both"/>
       </w:pPr>
       <w:r>
-        <w:t xml:space="preserve">В рамках практики разработана информационная система CYBERTAG с адаптивным многостраничным веб-интерфейсом, серверным приложением Node.js/Express и базой данных Microsoft SQL Server 2022 Express. Реализованы регистрация, вход, SQL-заказы, серверные сессии и административная панель для управления заказами и акциями.</w:t>
+        <w:t xml:space="preserve">В рамках практики разработана информационная система CYBERTAG с адаптивным многостраничным веб-интерфейсом, серверным приложением Node.js/Express и базой данных Microsoft SQL Server 2022 Express. Реализованы регистрация, SQL-заказы, серверные сессии и закрытая административная панель для управления заказами и акциями.</w:t>
       </w:r>
     </w:p>
     <w:p>
@@ -2211,7 +2211,7 @@
         <w:jc w:val="both"/>
       </w:pPr>
       <w:r>
-        <w:t xml:space="preserve">реализованы 9 таблиц, ограничения целостности, 5 представлений, 4 хранимые процедуры, 3 пользовательские функции и 14 параметризованных сценариев запросов в Microsoft SQL Server 2022 Express;</w:t>
+        <w:t xml:space="preserve">реализованы 9 таблиц, ограничения целостности, 5 представлений, 4 хранимые процедуры, 3 пользовательские функции и 15 параметризованных сценариев запросов в Microsoft SQL Server 2022 Express;</w:t>
       </w:r>
     </w:p>
     <w:p>
@@ -3474,7 +3474,7 @@
         <w:rPr>
           <w:lang w:val="en-US"/>
         </w:rPr>
-        <w:t xml:space="preserve">Административный поток начинается после проверки серверной сессии и роли admin. Панель запрашивает все заказы через GET /api/admin/orders, изменяет статус через PATCH и добавляет акции через POST /api/admin/promotions. Основные потоки данных представлены в таблице ниже:</w:t>
+        <w:t xml:space="preserve">Административный поток начинается после проверки серверной сессии и роли admin. Панель запрашивает заказы через GET, изменяет статус через PATCH, добавляет акции через POST и снимает их с публикации через DELETE. Гость и customer не получают содержимое /admin/. Основные потоки данных представлены в таблице ниже:</w:t>
       </w:r>
     </w:p>
     <w:p>
@@ -4647,7 +4647,7 @@
                 <w:sz w:val="24"/>
                 <w:szCs w:val="24"/>
               </w:rPr>
-              <w:t xml:space="preserve">Браузер</w:t>
+              <w:t xml:space="preserve">Администратор</w:t>
             </w:r>
           </w:p>
         </w:tc>
@@ -4675,7 +4675,7 @@
                 <w:sz w:val="24"/>
                 <w:szCs w:val="24"/>
               </w:rPr>
-              <w:t xml:space="preserve">GET /api/health</w:t>
+              <w:t xml:space="preserve">DELETE /api/admin/promotions/:id</w:t>
             </w:r>
           </w:p>
         </w:tc>
@@ -4703,7 +4703,7 @@
                 <w:sz w:val="24"/>
                 <w:szCs w:val="24"/>
               </w:rPr>
-              <w:t xml:space="preserve">SQL-счётчики</w:t>
+              <w:t xml:space="preserve">Проверка роли + UPDATE</w:t>
             </w:r>
           </w:p>
         </w:tc>
@@ -4731,7 +4731,7 @@
                 <w:sz w:val="24"/>
                 <w:szCs w:val="24"/>
               </w:rPr>
-              <w:t xml:space="preserve">Состояние БД</w:t>
+              <w:t xml:space="preserve">IsActive = 0</w:t>
             </w:r>
           </w:p>
         </w:tc>
@@ -4795,7 +4795,7 @@
                 <w:sz w:val="24"/>
                 <w:szCs w:val="24"/>
               </w:rPr>
-              <w:t xml:space="preserve">Статические страницы</w:t>
+              <w:t xml:space="preserve">GET /api/health</w:t>
             </w:r>
           </w:p>
         </w:tc>
@@ -4823,7 +4823,7 @@
                 <w:sz w:val="24"/>
                 <w:szCs w:val="24"/>
               </w:rPr>
-              <w:t xml:space="preserve">Express static</w:t>
+              <w:t xml:space="preserve">SQL-счётчики</w:t>
             </w:r>
           </w:p>
         </w:tc>
@@ -4851,7 +4851,7 @@
                 <w:sz w:val="24"/>
                 <w:szCs w:val="24"/>
               </w:rPr>
-              <w:t xml:space="preserve">HTML/CSS/JS и изображения</w:t>
+              <w:t xml:space="preserve">Состояние БД</w:t>
             </w:r>
           </w:p>
         </w:tc>
@@ -4887,7 +4887,7 @@
                 <w:sz w:val="24"/>
                 <w:szCs w:val="24"/>
               </w:rPr>
-              <w:t xml:space="preserve">Пользователь</w:t>
+              <w:t xml:space="preserve">Браузер</w:t>
             </w:r>
           </w:p>
         </w:tc>
@@ -4915,7 +4915,7 @@
                 <w:sz w:val="24"/>
                 <w:szCs w:val="24"/>
               </w:rPr>
-              <w:t xml:space="preserve">Корзина</w:t>
+              <w:t xml:space="preserve">Статические страницы</w:t>
             </w:r>
           </w:p>
         </w:tc>
@@ -4943,7 +4943,7 @@
                 <w:sz w:val="24"/>
                 <w:szCs w:val="24"/>
               </w:rPr>
-              <w:t xml:space="preserve">localStorage без персональных данных</w:t>
+              <w:t xml:space="preserve">Express static</w:t>
             </w:r>
           </w:p>
         </w:tc>
@@ -4971,7 +4971,7 @@
                 <w:sz w:val="24"/>
                 <w:szCs w:val="24"/>
               </w:rPr>
-              <w:t xml:space="preserve">Состав и сумма</w:t>
+              <w:t xml:space="preserve">HTML/CSS/JS и изображения</w:t>
             </w:r>
           </w:p>
         </w:tc>
@@ -5007,6 +5007,126 @@
                 <w:sz w:val="24"/>
                 <w:szCs w:val="24"/>
               </w:rPr>
+              <w:t xml:space="preserve">Пользователь</w:t>
+            </w:r>
+          </w:p>
+        </w:tc>
+        <w:tc>
+          <w:tcPr>
+            <w:tcW w:w="2200" w:type="dxa"/>
+            <w:tcBorders>
+              <w:top w:val="single" w:sz="4" w:space="0" w:color="000000"/>
+              <w:left w:val="single" w:sz="4" w:space="0" w:color="000000"/>
+              <w:bottom w:val="single" w:sz="4" w:space="0" w:color="000000"/>
+              <w:right w:val="single" w:sz="4" w:space="0" w:color="000000"/>
+            </w:tcBorders>
+            <w:shd w:val="clear" w:color="auto" w:fill="auto"/>
+            <w:tcMar>
+              <w:top w:w="60" w:type="dxa"/>
+              <w:left w:w="108" w:type="dxa"/>
+              <w:bottom w:w="60" w:type="dxa"/>
+              <w:right w:w="108" w:type="dxa"/>
+            </w:tcMar>
+            <w:vAlign w:val="center"/>
+          </w:tcPr>
+          <w:p>
+            <w:r>
+              <w:rPr>
+                <w:sz w:val="24"/>
+                <w:szCs w:val="24"/>
+              </w:rPr>
+              <w:t xml:space="preserve">Корзина</w:t>
+            </w:r>
+          </w:p>
+        </w:tc>
+        <w:tc>
+          <w:tcPr>
+            <w:tcW w:w="2200" w:type="dxa"/>
+            <w:tcBorders>
+              <w:top w:val="single" w:sz="4" w:space="0" w:color="000000"/>
+              <w:left w:val="single" w:sz="4" w:space="0" w:color="000000"/>
+              <w:bottom w:val="single" w:sz="4" w:space="0" w:color="000000"/>
+              <w:right w:val="single" w:sz="4" w:space="0" w:color="000000"/>
+            </w:tcBorders>
+            <w:shd w:val="clear" w:color="auto" w:fill="auto"/>
+            <w:tcMar>
+              <w:top w:w="60" w:type="dxa"/>
+              <w:left w:w="108" w:type="dxa"/>
+              <w:bottom w:w="60" w:type="dxa"/>
+              <w:right w:w="108" w:type="dxa"/>
+            </w:tcMar>
+            <w:vAlign w:val="center"/>
+          </w:tcPr>
+          <w:p>
+            <w:r>
+              <w:rPr>
+                <w:sz w:val="24"/>
+                <w:szCs w:val="24"/>
+              </w:rPr>
+              <w:t xml:space="preserve">localStorage без персональных данных</w:t>
+            </w:r>
+          </w:p>
+        </w:tc>
+        <w:tc>
+          <w:tcPr>
+            <w:tcW w:w="2800" w:type="dxa"/>
+            <w:tcBorders>
+              <w:top w:val="single" w:sz="4" w:space="0" w:color="000000"/>
+              <w:left w:val="single" w:sz="4" w:space="0" w:color="000000"/>
+              <w:bottom w:val="single" w:sz="4" w:space="0" w:color="000000"/>
+              <w:right w:val="single" w:sz="4" w:space="0" w:color="000000"/>
+            </w:tcBorders>
+            <w:shd w:val="clear" w:color="auto" w:fill="auto"/>
+            <w:tcMar>
+              <w:top w:w="60" w:type="dxa"/>
+              <w:left w:w="108" w:type="dxa"/>
+              <w:bottom w:w="60" w:type="dxa"/>
+              <w:right w:w="108" w:type="dxa"/>
+            </w:tcMar>
+            <w:vAlign w:val="center"/>
+          </w:tcPr>
+          <w:p>
+            <w:r>
+              <w:rPr>
+                <w:sz w:val="24"/>
+                <w:szCs w:val="24"/>
+              </w:rPr>
+              <w:t xml:space="preserve">Состав и сумма</w:t>
+            </w:r>
+          </w:p>
+        </w:tc>
+      </w:tr>
+      <w:tr>
+        <w:tblPrEx>
+          <w:tblCellMar>
+            <w:top w:w="0" w:type="dxa"/>
+            <w:bottom w:w="0" w:type="dxa"/>
+          </w:tblCellMar>
+        </w:tblPrEx>
+        <w:tc>
+          <w:tcPr>
+            <w:tcW w:w="2000" w:type="dxa"/>
+            <w:tcBorders>
+              <w:top w:val="single" w:sz="4" w:space="0" w:color="000000"/>
+              <w:left w:val="single" w:sz="4" w:space="0" w:color="000000"/>
+              <w:bottom w:val="single" w:sz="4" w:space="0" w:color="000000"/>
+              <w:right w:val="single" w:sz="4" w:space="0" w:color="000000"/>
+            </w:tcBorders>
+            <w:shd w:val="clear" w:color="auto" w:fill="auto"/>
+            <w:tcMar>
+              <w:top w:w="60" w:type="dxa"/>
+              <w:left w:w="108" w:type="dxa"/>
+              <w:bottom w:w="60" w:type="dxa"/>
+              <w:right w:w="108" w:type="dxa"/>
+            </w:tcMar>
+            <w:vAlign w:val="center"/>
+          </w:tcPr>
+          <w:p>
+            <w:r>
+              <w:rPr>
+                <w:sz w:val="24"/>
+                <w:szCs w:val="24"/>
+              </w:rPr>
               <w:t xml:space="preserve">Администратор</w:t>
             </w:r>
           </w:p>
@@ -5250,7 +5370,7 @@
         <w:jc w:val="both"/>
       </w:pPr>
       <w:r>
-        <w:t xml:space="preserve">разработать 14 параметризованных T-SQL сценариев запросов (sql/04_Queries.sql);</w:t>
+        <w:t xml:space="preserve">разработать 15 параметризованных T-SQL сценариев запросов (sql/04_Queries.sql);</w:t>
       </w:r>
     </w:p>
     <w:p>
@@ -5289,7 +5409,7 @@
         <w:jc w:val="both"/>
       </w:pPr>
       <w:r>
-        <w:t xml:space="preserve">реализовать панель администратора для просмотра заказов, изменения статуса и добавления акций;</w:t>
+        <w:t xml:space="preserve">реализовать закрытую панель администратора для просмотра заказов, изменения статуса, добавления и удаления акций;</w:t>
       </w:r>
     </w:p>
     <w:p>
@@ -6300,7 +6420,7 @@
         <w:jc w:val="both"/>
       </w:pPr>
       <w:r>
-        <w:t xml:space="preserve">Информационная система выполняет функции просмотра оборудования и комплектов, управления корзиной, регистрации, входа, создания SQL-заказа, проверки сессии, просмотра всех заказов администратором, изменения статуса и публикации акций.</w:t>
+        <w:t xml:space="preserve">Информационная система выполняет функции просмотра оборудования, управления корзиной, регистрации, создания SQL-заказа, проверки сессии, просмотра всех заказов администратором, изменения статуса, публикации и удаления акций.</w:t>
       </w:r>
     </w:p>
     <w:p>
@@ -7462,6 +7582,98 @@
                 <w:szCs w:val="24"/>
               </w:rPr>
               <w:t xml:space="preserve">Новая строка Promotions</w:t>
+            </w:r>
+          </w:p>
+        </w:tc>
+      </w:tr>
+      <w:tr>
+        <w:tblPrEx>
+          <w:tblCellMar>
+            <w:top w:w="0" w:type="dxa"/>
+            <w:bottom w:w="0" w:type="dxa"/>
+          </w:tblCellMar>
+        </w:tblPrEx>
+        <w:tc>
+          <w:tcPr>
+            <w:tcW w:w="2800" w:type="dxa"/>
+            <w:tcBorders>
+              <w:top w:val="single" w:sz="4" w:space="0" w:color="000000"/>
+              <w:left w:val="single" w:sz="4" w:space="0" w:color="000000"/>
+              <w:bottom w:val="single" w:sz="4" w:space="0" w:color="000000"/>
+              <w:right w:val="single" w:sz="4" w:space="0" w:color="000000"/>
+            </w:tcBorders>
+            <w:shd w:val="clear" w:color="auto" w:fill="auto"/>
+            <w:tcMar>
+              <w:top w:w="60" w:type="dxa"/>
+              <w:left w:w="108" w:type="dxa"/>
+              <w:bottom w:w="60" w:type="dxa"/>
+              <w:right w:w="108" w:type="dxa"/>
+            </w:tcMar>
+            <w:vAlign w:val="center"/>
+          </w:tcPr>
+          <w:p>
+            <w:r>
+              <w:rPr>
+                <w:sz w:val="24"/>
+                <w:szCs w:val="24"/>
+              </w:rPr>
+              <w:t xml:space="preserve">Удаление акции</w:t>
+            </w:r>
+          </w:p>
+        </w:tc>
+        <w:tc>
+          <w:tcPr>
+            <w:tcW w:w="2400" w:type="dxa"/>
+            <w:tcBorders>
+              <w:top w:val="single" w:sz="4" w:space="0" w:color="000000"/>
+              <w:left w:val="single" w:sz="4" w:space="0" w:color="000000"/>
+              <w:bottom w:val="single" w:sz="4" w:space="0" w:color="000000"/>
+              <w:right w:val="single" w:sz="4" w:space="0" w:color="000000"/>
+            </w:tcBorders>
+            <w:shd w:val="clear" w:color="auto" w:fill="auto"/>
+            <w:tcMar>
+              <w:top w:w="60" w:type="dxa"/>
+              <w:left w:w="108" w:type="dxa"/>
+              <w:bottom w:w="60" w:type="dxa"/>
+              <w:right w:w="108" w:type="dxa"/>
+            </w:tcMar>
+            <w:vAlign w:val="center"/>
+          </w:tcPr>
+          <w:p>
+            <w:r>
+              <w:rPr>
+                <w:sz w:val="24"/>
+                <w:szCs w:val="24"/>
+              </w:rPr>
+              <w:t xml:space="preserve">Панель</w:t>
+            </w:r>
+          </w:p>
+        </w:tc>
+        <w:tc>
+          <w:tcPr>
+            <w:tcW w:w="3954" w:type="dxa"/>
+            <w:tcBorders>
+              <w:top w:val="single" w:sz="4" w:space="0" w:color="000000"/>
+              <w:left w:val="single" w:sz="4" w:space="0" w:color="000000"/>
+              <w:bottom w:val="single" w:sz="4" w:space="0" w:color="000000"/>
+              <w:right w:val="single" w:sz="4" w:space="0" w:color="000000"/>
+            </w:tcBorders>
+            <w:shd w:val="clear" w:color="auto" w:fill="auto"/>
+            <w:tcMar>
+              <w:top w:w="60" w:type="dxa"/>
+              <w:left w:w="108" w:type="dxa"/>
+              <w:bottom w:w="60" w:type="dxa"/>
+              <w:right w:w="108" w:type="dxa"/>
+            </w:tcMar>
+            <w:vAlign w:val="center"/>
+          </w:tcPr>
+          <w:p>
+            <w:r>
+              <w:rPr>
+                <w:sz w:val="24"/>
+                <w:szCs w:val="24"/>
+              </w:rPr>
+              <w:t xml:space="preserve">Снятие с публикации через IsActive</w:t>
             </w:r>
           </w:p>
         </w:tc>
@@ -13743,7 +13955,7 @@
         <w:jc w:val="both"/>
       </w:pPr>
       <w:r>
-        <w:t xml:space="preserve">Параметризованные запросы находятся в sql/04_Queries.sql. Четырнадцать сценариев охватывают регистрацию, вход, сессии, каталог, создание и просмотр заказов, изменение статуса, чтение и добавление акций. Значения передаются через параметры mssql.</w:t>
+        <w:t xml:space="preserve">Параметризованные запросы находятся в sql/04_Queries.sql. Пятнадцать сценариев охватывают регистрацию, сессии, каталог, заказы, изменение статуса, чтение, добавление и снятие акций с публикации. Значения передаются через параметры mssql.</w:t>
       </w:r>
     </w:p>
     <w:tbl>
@@ -15167,6 +15379,98 @@
           </w:p>
         </w:tc>
       </w:tr>
+      <w:tr>
+        <w:tblPrEx>
+          <w:tblCellMar>
+            <w:top w:w="0" w:type="dxa"/>
+            <w:bottom w:w="0" w:type="dxa"/>
+          </w:tblCellMar>
+        </w:tblPrEx>
+        <w:tc>
+          <w:tcPr>
+            <w:tcW w:w="500" w:type="dxa"/>
+            <w:tcBorders>
+              <w:top w:val="single" w:sz="4" w:space="0" w:color="000000"/>
+              <w:left w:val="single" w:sz="4" w:space="0" w:color="000000"/>
+              <w:bottom w:val="single" w:sz="4" w:space="0" w:color="000000"/>
+              <w:right w:val="single" w:sz="4" w:space="0" w:color="000000"/>
+            </w:tcBorders>
+            <w:shd w:val="clear" w:color="auto" w:fill="auto"/>
+            <w:tcMar>
+              <w:top w:w="60" w:type="dxa"/>
+              <w:left w:w="108" w:type="dxa"/>
+              <w:bottom w:w="60" w:type="dxa"/>
+              <w:right w:w="108" w:type="dxa"/>
+            </w:tcMar>
+            <w:vAlign w:val="center"/>
+          </w:tcPr>
+          <w:p>
+            <w:r>
+              <w:rPr>
+                <w:sz w:val="24"/>
+                <w:szCs w:val="24"/>
+              </w:rPr>
+              <w:t xml:space="preserve">15</w:t>
+            </w:r>
+          </w:p>
+        </w:tc>
+        <w:tc>
+          <w:tcPr>
+            <w:tcW w:w="3600" w:type="dxa"/>
+            <w:tcBorders>
+              <w:top w:val="single" w:sz="4" w:space="0" w:color="000000"/>
+              <w:left w:val="single" w:sz="4" w:space="0" w:color="000000"/>
+              <w:bottom w:val="single" w:sz="4" w:space="0" w:color="000000"/>
+              <w:right w:val="single" w:sz="4" w:space="0" w:color="000000"/>
+            </w:tcBorders>
+            <w:shd w:val="clear" w:color="auto" w:fill="auto"/>
+            <w:tcMar>
+              <w:top w:w="60" w:type="dxa"/>
+              <w:left w:w="108" w:type="dxa"/>
+              <w:bottom w:w="60" w:type="dxa"/>
+              <w:right w:w="108" w:type="dxa"/>
+            </w:tcMar>
+            <w:vAlign w:val="center"/>
+          </w:tcPr>
+          <w:p>
+            <w:r>
+              <w:rPr>
+                <w:sz w:val="24"/>
+                <w:szCs w:val="24"/>
+              </w:rPr>
+              <w:t xml:space="preserve">Снять акцию с публикации</w:t>
+            </w:r>
+          </w:p>
+        </w:tc>
+        <w:tc>
+          <w:tcPr>
+            <w:tcW w:w="5054" w:type="dxa"/>
+            <w:tcBorders>
+              <w:top w:val="single" w:sz="4" w:space="0" w:color="000000"/>
+              <w:left w:val="single" w:sz="4" w:space="0" w:color="000000"/>
+              <w:bottom w:val="single" w:sz="4" w:space="0" w:color="000000"/>
+              <w:right w:val="single" w:sz="4" w:space="0" w:color="000000"/>
+            </w:tcBorders>
+            <w:shd w:val="clear" w:color="auto" w:fill="auto"/>
+            <w:tcMar>
+              <w:top w:w="60" w:type="dxa"/>
+              <w:left w:w="108" w:type="dxa"/>
+              <w:bottom w:w="60" w:type="dxa"/>
+              <w:right w:w="108" w:type="dxa"/>
+            </w:tcMar>
+            <w:vAlign w:val="center"/>
+          </w:tcPr>
+          <w:p>
+            <w:r>
+              <w:rPr>
+                <w:sz w:val="24"/>
+                <w:szCs w:val="24"/>
+              </w:rPr>
+              <w:t xml:space="preserve">@PromotionId</w:t>
+            </w:r>
+          </w:p>
+        </w:tc>
+      </w:tr>
     </w:tbl>
     <w:p>
       <w:pPr>
@@ -15228,7 +15532,7 @@
         <w:jc w:val="both"/>
       </w:pPr>
       <w:r>
-        <w:t xml:space="preserve">Реализована база CybertagShop в Microsoft SQL Server 2022 Express, содержащая 9 взаимосвязанных таблиц. Целостность обеспечивается первичными и внешними ключами, CHECK-, UNIQUE- и DEFAULT-ограничениями. Подготовлены скрипты схемы, тестовых данных, 14 параметризованных сценариев запросов, 5 представлений, 4 процедуры и 3 функции.</w:t>
+        <w:t xml:space="preserve">Реализована база CybertagShop в Microsoft SQL Server 2022 Express, содержащая 9 взаимосвязанных таблиц. Целостность обеспечивается первичными и внешними ключами, CHECK-, UNIQUE- и DEFAULT-ограничениями. Подготовлены скрипты схемы, тестовых данных, 15 параметризованных сценариев запросов, 5 представлений, 4 процедуры и 3 функции.</w:t>
       </w:r>
     </w:p>
     <w:p>
@@ -17975,7 +18279,7 @@
         <w:jc w:val="both"/>
       </w:pPr>
       <w:r>
-        <w:t xml:space="preserve">Панель администратора содержит форму добавления акции, список действующих акций и таблицу всех заказов. Для каждого заказа отображаются клиент, состав, сумма и раскрывающийся список статуса. Доступ разрешён только роли admin.</w:t>
+        <w:t xml:space="preserve">Панель администратора содержит форму добавления акции, список действующих акций с кнопками удаления и таблицу всех заказов. Для заказа отображаются клиент, состав, сумма и статус. Сервер отдаёт /admin/ только роли admin; остальные пользователи перенаправляются.</w:t>
       </w:r>
     </w:p>
     <w:tbl>
@@ -18935,6 +19239,98 @@
                 <w:szCs w:val="24"/>
               </w:rPr>
               <w:t xml:space="preserve">Успех 201</w:t>
+            </w:r>
+          </w:p>
+        </w:tc>
+      </w:tr>
+      <w:tr>
+        <w:tblPrEx>
+          <w:tblCellMar>
+            <w:top w:w="0" w:type="dxa"/>
+            <w:bottom w:w="0" w:type="dxa"/>
+          </w:tblCellMar>
+        </w:tblPrEx>
+        <w:tc>
+          <w:tcPr>
+            <w:tcW w:w="2800" w:type="dxa"/>
+            <w:tcBorders>
+              <w:top w:val="single" w:sz="4" w:space="0" w:color="000000"/>
+              <w:left w:val="single" w:sz="4" w:space="0" w:color="000000"/>
+              <w:bottom w:val="single" w:sz="4" w:space="0" w:color="000000"/>
+              <w:right w:val="single" w:sz="4" w:space="0" w:color="000000"/>
+            </w:tcBorders>
+            <w:shd w:val="clear" w:color="auto" w:fill="auto"/>
+            <w:tcMar>
+              <w:top w:w="60" w:type="dxa"/>
+              <w:left w:w="108" w:type="dxa"/>
+              <w:bottom w:w="60" w:type="dxa"/>
+              <w:right w:w="108" w:type="dxa"/>
+            </w:tcMar>
+            <w:vAlign w:val="center"/>
+          </w:tcPr>
+          <w:p>
+            <w:r>
+              <w:rPr>
+                <w:sz w:val="24"/>
+                <w:szCs w:val="24"/>
+              </w:rPr>
+              <w:t xml:space="preserve">Акция удалена</w:t>
+            </w:r>
+          </w:p>
+        </w:tc>
+        <w:tc>
+          <w:tcPr>
+            <w:tcW w:w="3500" w:type="dxa"/>
+            <w:tcBorders>
+              <w:top w:val="single" w:sz="4" w:space="0" w:color="000000"/>
+              <w:left w:val="single" w:sz="4" w:space="0" w:color="000000"/>
+              <w:bottom w:val="single" w:sz="4" w:space="0" w:color="000000"/>
+              <w:right w:val="single" w:sz="4" w:space="0" w:color="000000"/>
+            </w:tcBorders>
+            <w:shd w:val="clear" w:color="auto" w:fill="auto"/>
+            <w:tcMar>
+              <w:top w:w="60" w:type="dxa"/>
+              <w:left w:w="108" w:type="dxa"/>
+              <w:bottom w:w="60" w:type="dxa"/>
+              <w:right w:w="108" w:type="dxa"/>
+            </w:tcMar>
+            <w:vAlign w:val="center"/>
+          </w:tcPr>
+          <w:p>
+            <w:r>
+              <w:rPr>
+                <w:sz w:val="24"/>
+                <w:szCs w:val="24"/>
+              </w:rPr>
+              <w:t xml:space="preserve">Акция снята с публикации.</w:t>
+            </w:r>
+          </w:p>
+        </w:tc>
+        <w:tc>
+          <w:tcPr>
+            <w:tcW w:w="2854" w:type="dxa"/>
+            <w:tcBorders>
+              <w:top w:val="single" w:sz="4" w:space="0" w:color="000000"/>
+              <w:left w:val="single" w:sz="4" w:space="0" w:color="000000"/>
+              <w:bottom w:val="single" w:sz="4" w:space="0" w:color="000000"/>
+              <w:right w:val="single" w:sz="4" w:space="0" w:color="000000"/>
+            </w:tcBorders>
+            <w:shd w:val="clear" w:color="auto" w:fill="auto"/>
+            <w:tcMar>
+              <w:top w:w="60" w:type="dxa"/>
+              <w:left w:w="108" w:type="dxa"/>
+              <w:bottom w:w="60" w:type="dxa"/>
+              <w:right w:w="108" w:type="dxa"/>
+            </w:tcMar>
+            <w:vAlign w:val="center"/>
+          </w:tcPr>
+          <w:p>
+            <w:r>
+              <w:rPr>
+                <w:sz w:val="24"/>
+                <w:szCs w:val="24"/>
+              </w:rPr>
+              <w:t xml:space="preserve">Успех 200</w:t>
             </w:r>
           </w:p>
         </w:tc>

</xml_diff>